<commit_message>
Incorporar formulacion matematica completa, modelos fisicos y algoritmos de ingenieria en el Manual de Usuario
</commit_message>
<xml_diff>
--- a/Manual_de_Usuario_Simulador_FV_ALP_GROUP.docx
+++ b/Manual_de_Usuario_Simulador_FV_ALP_GROUP.docx
@@ -4045,7 +4045,25 @@
         <w:rPr>
           <w:color w:val="009FE3"/>
         </w:rPr>
-        <w:t>5. Formulación Matemática y Algoritmos de Ingeniería</w:t>
+        <w:t>5. Formulación Matemática, Modelos Físicos y Algoritmos de Ingeniería</w:t>
+      </w:r>
+    </w:p>
+    <w:p>
+      <w:r>
+        <w:t>Esta sección documenta de manera exhaustiva el fundamento teórico, las leyes físicas, las normas internacionales y los modelos matemáticos y financieros implementados en el motor de cálculo (calc.js) del Simulador Fotovoltaico de ALP GROUP.</w:t>
+      </w:r>
+    </w:p>
+    <w:p>
+      <w:pPr>
+        <w:pStyle w:val="Heading2"/>
+      </w:pPr>
+      <w:r>
+        <w:t>5.1. Modelo Físico de Radiación Solar y Generación Fotovoltaica</w:t>
+      </w:r>
+    </w:p>
+    <w:p>
+      <w:r>
+        <w:t>La estimación de producción eléctrica anual y mensual se calcula a partir de la potencia pico instalada (kWp), la irradiación global horizontal/inclinada anual del sitio (kWh/m²/año) y el Performance Ratio (PR) del sistema:</w:t>
       </w:r>
     </w:p>
     <w:p>
@@ -4054,21 +4072,737 @@
       </w:pPr>
       <w:r>
         <w:rPr>
-          <w:b/>
-          <w:color w:val="009FE3"/>
-        </w:rPr>
-        <w:t>1. Valor Actual Neto (VAN):</w:t>
-        <w:br/>
-      </w:r>
-      <w:r>
-        <w:rPr>
           <w:rFonts w:ascii="Consolas" w:hAnsi="Consolas"/>
           <w:color w:val="1E293B"/>
-          <w:sz w:val="19"/>
+          <w:sz w:val="18"/>
         </w:rPr>
-        <w:t>VAN = -CAPEX + ∑ [ Flujo_t / (1 + r)^t ]</w:t>
+        <w:t>1. Generación Eléctrica Anual Año 1 (kWh/año):</w:t>
         <w:br/>
-        <w:t>Donde r es la tasa de descuento anual (WACC) y Flujo_t es el ahorro neto del año t.</w:t>
+        <w:t xml:space="preserve">   E_anual = P_kWp × H_anual × (PR / 100)</w:t>
+        <w:br/>
+        <w:br/>
+        <w:t>2. Rendimiento Específico / Yield del Sistema (kWh/kWp/año):</w:t>
+        <w:br/>
+        <w:t xml:space="preserve">   Y_f = E_anual / P_kWp = H_anual × (PR / 100)</w:t>
+        <w:br/>
+        <w:br/>
+        <w:t>3. Distribución Estacional Mensual (kWh/mes):</w:t>
+        <w:br/>
+        <w:t xml:space="preserve">   E_gen,m = E_anual × f_m   (para m = 1, 2, ..., 12)</w:t>
+        <w:br/>
+        <w:br/>
+        <w:t xml:space="preserve">   Donde f_m es el vector de coeficientes normalizados para el Hemisferio Sur (Centro/Norte de Argentina):</w:t>
+        <w:br/>
+        <w:t xml:space="preserve">   f = [Ene: 0.1094, Feb: 0.0979, Mar: 0.0891, Abr: 0.0736, May: 0.0591, Jun: 0.0502,</w:t>
+        <w:br/>
+        <w:t xml:space="preserve">        Jul: 0.0532, Ago: 0.0676, Sep: 0.0835, Oct: 0.0986, Nov: 0.1065, Dic: 0.1113]  (∑ f_m = 1.0000)</w:t>
+      </w:r>
+    </w:p>
+    <w:p>
+      <w:pPr>
+        <w:pStyle w:val="Heading2"/>
+      </w:pPr>
+      <w:r>
+        <w:t>5.2. Modelo Físico de Pérdidas Técnicas y Performance Ratio (PR)</w:t>
+      </w:r>
+    </w:p>
+    <w:p>
+      <w:r>
+        <w:t>El Performance Ratio (PR) evalúa la calidad global de la instalación descontando las atenuaciones energéticas en cascada:</w:t>
+      </w:r>
+    </w:p>
+    <w:tbl>
+      <w:tblPr>
+        <w:tblW w:type="auto" w:w="0"/>
+        <w:jc w:val="center"/>
+        <w:tblLook w:firstColumn="1" w:firstRow="1" w:lastColumn="0" w:lastRow="0" w:noHBand="0" w:noVBand="1" w:val="04A0"/>
+      </w:tblPr>
+      <w:tblGrid>
+        <w:gridCol w:w="3168"/>
+        <w:gridCol w:w="1728"/>
+        <w:gridCol w:w="4464"/>
+      </w:tblGrid>
+      <w:tr>
+        <w:tc>
+          <w:tcPr>
+            <w:tcW w:type="dxa" w:w="3120"/>
+            <w:shd w:fill="009FE3"/>
+            <w:tcMar>
+              <w:top w:w="80" w:type="dxa"/>
+              <w:bottom w:w="80" w:type="dxa"/>
+              <w:left w:w="120" w:type="dxa"/>
+              <w:right w:w="120" w:type="dxa"/>
+            </w:tcMar>
+            <w:vAlign w:val="center"/>
+          </w:tcPr>
+          <w:p>
+            <w:pPr>
+              <w:spacing w:before="40" w:after="40"/>
+            </w:pPr>
+            <w:r>
+              <w:rPr>
+                <w:rFonts w:ascii="Calibri" w:hAnsi="Calibri"/>
+                <w:b/>
+                <w:color w:val="FFFFFF"/>
+                <w:sz w:val="19"/>
+              </w:rPr>
+              <w:t>Etapa / Factor de Pérdida</w:t>
+            </w:r>
+          </w:p>
+        </w:tc>
+        <w:tc>
+          <w:tcPr>
+            <w:tcW w:type="dxa" w:w="3120"/>
+            <w:shd w:fill="009FE3"/>
+            <w:tcMar>
+              <w:top w:w="80" w:type="dxa"/>
+              <w:bottom w:w="80" w:type="dxa"/>
+              <w:left w:w="120" w:type="dxa"/>
+              <w:right w:w="120" w:type="dxa"/>
+            </w:tcMar>
+            <w:vAlign w:val="center"/>
+          </w:tcPr>
+          <w:p>
+            <w:pPr>
+              <w:spacing w:before="40" w:after="40"/>
+            </w:pPr>
+            <w:r>
+              <w:rPr>
+                <w:rFonts w:ascii="Calibri" w:hAnsi="Calibri"/>
+                <w:b/>
+                <w:color w:val="FFFFFF"/>
+                <w:sz w:val="19"/>
+              </w:rPr>
+              <w:t>Coeficiente (%)</w:t>
+            </w:r>
+          </w:p>
+        </w:tc>
+        <w:tc>
+          <w:tcPr>
+            <w:tcW w:type="dxa" w:w="3120"/>
+            <w:shd w:fill="009FE3"/>
+            <w:tcMar>
+              <w:top w:w="80" w:type="dxa"/>
+              <w:bottom w:w="80" w:type="dxa"/>
+              <w:left w:w="120" w:type="dxa"/>
+              <w:right w:w="120" w:type="dxa"/>
+            </w:tcMar>
+            <w:vAlign w:val="center"/>
+          </w:tcPr>
+          <w:p>
+            <w:pPr>
+              <w:spacing w:before="40" w:after="40"/>
+            </w:pPr>
+            <w:r>
+              <w:rPr>
+                <w:rFonts w:ascii="Calibri" w:hAnsi="Calibri"/>
+                <w:b/>
+                <w:color w:val="FFFFFF"/>
+                <w:sz w:val="19"/>
+              </w:rPr>
+              <w:t>Fundamento Físico y Normativo</w:t>
+            </w:r>
+          </w:p>
+        </w:tc>
+      </w:tr>
+      <w:tr>
+        <w:tc>
+          <w:tcPr>
+            <w:tcW w:type="dxa" w:w="3120"/>
+            <w:shd w:fill="F8FAFC"/>
+            <w:tcMar>
+              <w:top w:w="80" w:type="dxa"/>
+              <w:bottom w:w="80" w:type="dxa"/>
+              <w:left w:w="120" w:type="dxa"/>
+              <w:right w:w="120" w:type="dxa"/>
+            </w:tcMar>
+            <w:vAlign w:val="center"/>
+          </w:tcPr>
+          <w:p>
+            <w:pPr>
+              <w:spacing w:before="40" w:after="40"/>
+            </w:pPr>
+            <w:r>
+              <w:rPr>
+                <w:rFonts w:ascii="Calibri" w:hAnsi="Calibri"/>
+                <w:b w:val="0"/>
+                <w:color w:val="334155"/>
+                <w:sz w:val="17"/>
+              </w:rPr>
+              <w:t>Temperatura de Celdas (P_temp)</w:t>
+            </w:r>
+          </w:p>
+        </w:tc>
+        <w:tc>
+          <w:tcPr>
+            <w:tcW w:type="dxa" w:w="3120"/>
+            <w:shd w:fill="F8FAFC"/>
+            <w:tcMar>
+              <w:top w:w="80" w:type="dxa"/>
+              <w:bottom w:w="80" w:type="dxa"/>
+              <w:left w:w="120" w:type="dxa"/>
+              <w:right w:w="120" w:type="dxa"/>
+            </w:tcMar>
+            <w:vAlign w:val="center"/>
+          </w:tcPr>
+          <w:p>
+            <w:pPr>
+              <w:spacing w:before="40" w:after="40"/>
+            </w:pPr>
+            <w:r>
+              <w:rPr>
+                <w:rFonts w:ascii="Calibri" w:hAnsi="Calibri"/>
+                <w:b w:val="0"/>
+                <w:color w:val="334155"/>
+                <w:sz w:val="17"/>
+              </w:rPr>
+              <w:t>4.2% - 6.2%</w:t>
+            </w:r>
+          </w:p>
+        </w:tc>
+        <w:tc>
+          <w:tcPr>
+            <w:tcW w:type="dxa" w:w="3120"/>
+            <w:shd w:fill="F8FAFC"/>
+            <w:tcMar>
+              <w:top w:w="80" w:type="dxa"/>
+              <w:bottom w:w="80" w:type="dxa"/>
+              <w:left w:w="120" w:type="dxa"/>
+              <w:right w:w="120" w:type="dxa"/>
+            </w:tcMar>
+            <w:vAlign w:val="center"/>
+          </w:tcPr>
+          <w:p>
+            <w:pPr>
+              <w:spacing w:before="40" w:after="40"/>
+            </w:pPr>
+            <w:r>
+              <w:rPr>
+                <w:rFonts w:ascii="Calibri" w:hAnsi="Calibri"/>
+                <w:b w:val="0"/>
+                <w:color w:val="334155"/>
+                <w:sz w:val="17"/>
+              </w:rPr>
+              <w:t>Coeficiente térmico de potencia γ_Pmp (~ -0.35%/°C) sobre 25°C STC. Varia según ventilación (Chapa: 6.2%, Losa: 4.9%, Suelo: 4.2%).</w:t>
+            </w:r>
+          </w:p>
+        </w:tc>
+      </w:tr>
+      <w:tr>
+        <w:tc>
+          <w:tcPr>
+            <w:tcW w:type="dxa" w:w="3120"/>
+            <w:shd w:fill="FFFFFF"/>
+            <w:tcMar>
+              <w:top w:w="80" w:type="dxa"/>
+              <w:bottom w:w="80" w:type="dxa"/>
+              <w:left w:w="120" w:type="dxa"/>
+              <w:right w:w="120" w:type="dxa"/>
+            </w:tcMar>
+            <w:vAlign w:val="center"/>
+          </w:tcPr>
+          <w:p>
+            <w:pPr>
+              <w:spacing w:before="40" w:after="40"/>
+            </w:pPr>
+            <w:r>
+              <w:rPr>
+                <w:rFonts w:ascii="Calibri" w:hAnsi="Calibri"/>
+                <w:b w:val="0"/>
+                <w:color w:val="334155"/>
+                <w:sz w:val="17"/>
+              </w:rPr>
+              <w:t>Suciedad Superficial (Soiling)</w:t>
+            </w:r>
+          </w:p>
+        </w:tc>
+        <w:tc>
+          <w:tcPr>
+            <w:tcW w:type="dxa" w:w="3120"/>
+            <w:shd w:fill="FFFFFF"/>
+            <w:tcMar>
+              <w:top w:w="80" w:type="dxa"/>
+              <w:bottom w:w="80" w:type="dxa"/>
+              <w:left w:w="120" w:type="dxa"/>
+              <w:right w:w="120" w:type="dxa"/>
+            </w:tcMar>
+            <w:vAlign w:val="center"/>
+          </w:tcPr>
+          <w:p>
+            <w:pPr>
+              <w:spacing w:before="40" w:after="40"/>
+            </w:pPr>
+            <w:r>
+              <w:rPr>
+                <w:rFonts w:ascii="Calibri" w:hAnsi="Calibri"/>
+                <w:b w:val="0"/>
+                <w:color w:val="334155"/>
+                <w:sz w:val="17"/>
+              </w:rPr>
+              <w:t>3.0%</w:t>
+            </w:r>
+          </w:p>
+        </w:tc>
+        <w:tc>
+          <w:tcPr>
+            <w:tcW w:type="dxa" w:w="3120"/>
+            <w:shd w:fill="FFFFFF"/>
+            <w:tcMar>
+              <w:top w:w="80" w:type="dxa"/>
+              <w:bottom w:w="80" w:type="dxa"/>
+              <w:left w:w="120" w:type="dxa"/>
+              <w:right w:w="120" w:type="dxa"/>
+            </w:tcMar>
+            <w:vAlign w:val="center"/>
+          </w:tcPr>
+          <w:p>
+            <w:pPr>
+              <w:spacing w:before="40" w:after="40"/>
+            </w:pPr>
+            <w:r>
+              <w:rPr>
+                <w:rFonts w:ascii="Calibri" w:hAnsi="Calibri"/>
+                <w:b w:val="0"/>
+                <w:color w:val="334155"/>
+                <w:sz w:val="17"/>
+              </w:rPr>
+              <w:t>Atenuación óptica por deposición de polvo, polvillo agrícola y hollín ambiental sobre el vidrio frontal.</w:t>
+            </w:r>
+          </w:p>
+        </w:tc>
+      </w:tr>
+      <w:tr>
+        <w:tc>
+          <w:tcPr>
+            <w:tcW w:type="dxa" w:w="3120"/>
+            <w:shd w:fill="F8FAFC"/>
+            <w:tcMar>
+              <w:top w:w="80" w:type="dxa"/>
+              <w:bottom w:w="80" w:type="dxa"/>
+              <w:left w:w="120" w:type="dxa"/>
+              <w:right w:w="120" w:type="dxa"/>
+            </w:tcMar>
+            <w:vAlign w:val="center"/>
+          </w:tcPr>
+          <w:p>
+            <w:pPr>
+              <w:spacing w:before="40" w:after="40"/>
+            </w:pPr>
+            <w:r>
+              <w:rPr>
+                <w:rFonts w:ascii="Calibri" w:hAnsi="Calibri"/>
+                <w:b w:val="0"/>
+                <w:color w:val="334155"/>
+                <w:sz w:val="17"/>
+              </w:rPr>
+              <w:t>Mismatch / Tolerancia Fabril</w:t>
+            </w:r>
+          </w:p>
+        </w:tc>
+        <w:tc>
+          <w:tcPr>
+            <w:tcW w:type="dxa" w:w="3120"/>
+            <w:shd w:fill="F8FAFC"/>
+            <w:tcMar>
+              <w:top w:w="80" w:type="dxa"/>
+              <w:bottom w:w="80" w:type="dxa"/>
+              <w:left w:w="120" w:type="dxa"/>
+              <w:right w:w="120" w:type="dxa"/>
+            </w:tcMar>
+            <w:vAlign w:val="center"/>
+          </w:tcPr>
+          <w:p>
+            <w:pPr>
+              <w:spacing w:before="40" w:after="40"/>
+            </w:pPr>
+            <w:r>
+              <w:rPr>
+                <w:rFonts w:ascii="Calibri" w:hAnsi="Calibri"/>
+                <w:b w:val="0"/>
+                <w:color w:val="334155"/>
+                <w:sz w:val="17"/>
+              </w:rPr>
+              <w:t>1.5%</w:t>
+            </w:r>
+          </w:p>
+        </w:tc>
+        <w:tc>
+          <w:tcPr>
+            <w:tcW w:type="dxa" w:w="3120"/>
+            <w:shd w:fill="F8FAFC"/>
+            <w:tcMar>
+              <w:top w:w="80" w:type="dxa"/>
+              <w:bottom w:w="80" w:type="dxa"/>
+              <w:left w:w="120" w:type="dxa"/>
+              <w:right w:w="120" w:type="dxa"/>
+            </w:tcMar>
+            <w:vAlign w:val="center"/>
+          </w:tcPr>
+          <w:p>
+            <w:pPr>
+              <w:spacing w:before="40" w:after="40"/>
+            </w:pPr>
+            <w:r>
+              <w:rPr>
+                <w:rFonts w:ascii="Calibri" w:hAnsi="Calibri"/>
+                <w:b w:val="0"/>
+                <w:color w:val="334155"/>
+                <w:sz w:val="17"/>
+              </w:rPr>
+              <w:t>Dispersión de parámetros I-V entre módulos conectados en serie y curvas de máxima potencia (MPPT).</w:t>
+            </w:r>
+          </w:p>
+        </w:tc>
+      </w:tr>
+      <w:tr>
+        <w:tc>
+          <w:tcPr>
+            <w:tcW w:type="dxa" w:w="3120"/>
+            <w:shd w:fill="FFFFFF"/>
+            <w:tcMar>
+              <w:top w:w="80" w:type="dxa"/>
+              <w:bottom w:w="80" w:type="dxa"/>
+              <w:left w:w="120" w:type="dxa"/>
+              <w:right w:w="120" w:type="dxa"/>
+            </w:tcMar>
+            <w:vAlign w:val="center"/>
+          </w:tcPr>
+          <w:p>
+            <w:pPr>
+              <w:spacing w:before="40" w:after="40"/>
+            </w:pPr>
+            <w:r>
+              <w:rPr>
+                <w:rFonts w:ascii="Calibri" w:hAnsi="Calibri"/>
+                <w:b w:val="0"/>
+                <w:color w:val="334155"/>
+                <w:sz w:val="17"/>
+              </w:rPr>
+              <w:t>Cableado Continuo DC (Joule)</w:t>
+            </w:r>
+          </w:p>
+        </w:tc>
+        <w:tc>
+          <w:tcPr>
+            <w:tcW w:type="dxa" w:w="3120"/>
+            <w:shd w:fill="FFFFFF"/>
+            <w:tcMar>
+              <w:top w:w="80" w:type="dxa"/>
+              <w:bottom w:w="80" w:type="dxa"/>
+              <w:left w:w="120" w:type="dxa"/>
+              <w:right w:w="120" w:type="dxa"/>
+            </w:tcMar>
+            <w:vAlign w:val="center"/>
+          </w:tcPr>
+          <w:p>
+            <w:pPr>
+              <w:spacing w:before="40" w:after="40"/>
+            </w:pPr>
+            <w:r>
+              <w:rPr>
+                <w:rFonts w:ascii="Calibri" w:hAnsi="Calibri"/>
+                <w:b w:val="0"/>
+                <w:color w:val="334155"/>
+                <w:sz w:val="17"/>
+              </w:rPr>
+              <w:t>1.2%</w:t>
+            </w:r>
+          </w:p>
+        </w:tc>
+        <w:tc>
+          <w:tcPr>
+            <w:tcW w:type="dxa" w:w="3120"/>
+            <w:shd w:fill="FFFFFF"/>
+            <w:tcMar>
+              <w:top w:w="80" w:type="dxa"/>
+              <w:bottom w:w="80" w:type="dxa"/>
+              <w:left w:w="120" w:type="dxa"/>
+              <w:right w:w="120" w:type="dxa"/>
+            </w:tcMar>
+            <w:vAlign w:val="center"/>
+          </w:tcPr>
+          <w:p>
+            <w:pPr>
+              <w:spacing w:before="40" w:after="40"/>
+            </w:pPr>
+            <w:r>
+              <w:rPr>
+                <w:rFonts w:ascii="Calibri" w:hAnsi="Calibri"/>
+                <w:b w:val="0"/>
+                <w:color w:val="334155"/>
+                <w:sz w:val="17"/>
+              </w:rPr>
+              <w:t>Pérdidas resistivas I²R en conductores solares de 4/6 mm² desde strings hasta inversores.</w:t>
+            </w:r>
+          </w:p>
+        </w:tc>
+      </w:tr>
+      <w:tr>
+        <w:tc>
+          <w:tcPr>
+            <w:tcW w:type="dxa" w:w="3120"/>
+            <w:shd w:fill="F8FAFC"/>
+            <w:tcMar>
+              <w:top w:w="80" w:type="dxa"/>
+              <w:bottom w:w="80" w:type="dxa"/>
+              <w:left w:w="120" w:type="dxa"/>
+              <w:right w:w="120" w:type="dxa"/>
+            </w:tcMar>
+            <w:vAlign w:val="center"/>
+          </w:tcPr>
+          <w:p>
+            <w:pPr>
+              <w:spacing w:before="40" w:after="40"/>
+            </w:pPr>
+            <w:r>
+              <w:rPr>
+                <w:rFonts w:ascii="Calibri" w:hAnsi="Calibri"/>
+                <w:b w:val="0"/>
+                <w:color w:val="334155"/>
+                <w:sz w:val="17"/>
+              </w:rPr>
+              <w:t>Eficiencia del Inversor (η_inv)</w:t>
+            </w:r>
+          </w:p>
+        </w:tc>
+        <w:tc>
+          <w:tcPr>
+            <w:tcW w:type="dxa" w:w="3120"/>
+            <w:shd w:fill="F8FAFC"/>
+            <w:tcMar>
+              <w:top w:w="80" w:type="dxa"/>
+              <w:bottom w:w="80" w:type="dxa"/>
+              <w:left w:w="120" w:type="dxa"/>
+              <w:right w:w="120" w:type="dxa"/>
+            </w:tcMar>
+            <w:vAlign w:val="center"/>
+          </w:tcPr>
+          <w:p>
+            <w:pPr>
+              <w:spacing w:before="40" w:after="40"/>
+            </w:pPr>
+            <w:r>
+              <w:rPr>
+                <w:rFonts w:ascii="Calibri" w:hAnsi="Calibri"/>
+                <w:b w:val="0"/>
+                <w:color w:val="334155"/>
+                <w:sz w:val="17"/>
+              </w:rPr>
+              <w:t>2.1%</w:t>
+            </w:r>
+          </w:p>
+        </w:tc>
+        <w:tc>
+          <w:tcPr>
+            <w:tcW w:type="dxa" w:w="3120"/>
+            <w:shd w:fill="F8FAFC"/>
+            <w:tcMar>
+              <w:top w:w="80" w:type="dxa"/>
+              <w:bottom w:w="80" w:type="dxa"/>
+              <w:left w:w="120" w:type="dxa"/>
+              <w:right w:w="120" w:type="dxa"/>
+            </w:tcMar>
+            <w:vAlign w:val="center"/>
+          </w:tcPr>
+          <w:p>
+            <w:pPr>
+              <w:spacing w:before="40" w:after="40"/>
+            </w:pPr>
+            <w:r>
+              <w:rPr>
+                <w:rFonts w:ascii="Calibri" w:hAnsi="Calibri"/>
+                <w:b w:val="0"/>
+                <w:color w:val="334155"/>
+                <w:sz w:val="17"/>
+              </w:rPr>
+              <w:t>Rendimiento ponderado de conversión DC a AC trifásica/monofásica (eficiencia típica 97.9%).</w:t>
+            </w:r>
+          </w:p>
+        </w:tc>
+      </w:tr>
+      <w:tr>
+        <w:tc>
+          <w:tcPr>
+            <w:tcW w:type="dxa" w:w="3120"/>
+            <w:shd w:fill="FFFFFF"/>
+            <w:tcMar>
+              <w:top w:w="80" w:type="dxa"/>
+              <w:bottom w:w="80" w:type="dxa"/>
+              <w:left w:w="120" w:type="dxa"/>
+              <w:right w:w="120" w:type="dxa"/>
+            </w:tcMar>
+            <w:vAlign w:val="center"/>
+          </w:tcPr>
+          <w:p>
+            <w:pPr>
+              <w:spacing w:before="40" w:after="40"/>
+            </w:pPr>
+            <w:r>
+              <w:rPr>
+                <w:rFonts w:ascii="Calibri" w:hAnsi="Calibri"/>
+                <w:b w:val="0"/>
+                <w:color w:val="334155"/>
+                <w:sz w:val="17"/>
+              </w:rPr>
+              <w:t>Cableado Alterno AC (Joule)</w:t>
+            </w:r>
+          </w:p>
+        </w:tc>
+        <w:tc>
+          <w:tcPr>
+            <w:tcW w:type="dxa" w:w="3120"/>
+            <w:shd w:fill="FFFFFF"/>
+            <w:tcMar>
+              <w:top w:w="80" w:type="dxa"/>
+              <w:bottom w:w="80" w:type="dxa"/>
+              <w:left w:w="120" w:type="dxa"/>
+              <w:right w:w="120" w:type="dxa"/>
+            </w:tcMar>
+            <w:vAlign w:val="center"/>
+          </w:tcPr>
+          <w:p>
+            <w:pPr>
+              <w:spacing w:before="40" w:after="40"/>
+            </w:pPr>
+            <w:r>
+              <w:rPr>
+                <w:rFonts w:ascii="Calibri" w:hAnsi="Calibri"/>
+                <w:b w:val="0"/>
+                <w:color w:val="334155"/>
+                <w:sz w:val="17"/>
+              </w:rPr>
+              <w:t>0.8%</w:t>
+            </w:r>
+          </w:p>
+        </w:tc>
+        <w:tc>
+          <w:tcPr>
+            <w:tcW w:type="dxa" w:w="3120"/>
+            <w:shd w:fill="FFFFFF"/>
+            <w:tcMar>
+              <w:top w:w="80" w:type="dxa"/>
+              <w:bottom w:w="80" w:type="dxa"/>
+              <w:left w:w="120" w:type="dxa"/>
+              <w:right w:w="120" w:type="dxa"/>
+            </w:tcMar>
+            <w:vAlign w:val="center"/>
+          </w:tcPr>
+          <w:p>
+            <w:pPr>
+              <w:spacing w:before="40" w:after="40"/>
+            </w:pPr>
+            <w:r>
+              <w:rPr>
+                <w:rFonts w:ascii="Calibri" w:hAnsi="Calibri"/>
+                <w:b w:val="0"/>
+                <w:color w:val="334155"/>
+                <w:sz w:val="17"/>
+              </w:rPr>
+              <w:t>Caída óhmica de tensión entre bornes de salida del inversor y el tablero general de baja tensión.</w:t>
+            </w:r>
+          </w:p>
+        </w:tc>
+      </w:tr>
+      <w:tr>
+        <w:tc>
+          <w:tcPr>
+            <w:tcW w:type="dxa" w:w="3120"/>
+            <w:shd w:fill="E0F2FE"/>
+            <w:tcMar>
+              <w:top w:w="80" w:type="dxa"/>
+              <w:bottom w:w="80" w:type="dxa"/>
+              <w:left w:w="120" w:type="dxa"/>
+              <w:right w:w="120" w:type="dxa"/>
+            </w:tcMar>
+            <w:vAlign w:val="center"/>
+          </w:tcPr>
+          <w:p>
+            <w:pPr>
+              <w:spacing w:before="40" w:after="40"/>
+            </w:pPr>
+            <w:r>
+              <w:rPr>
+                <w:rFonts w:ascii="Calibri" w:hAnsi="Calibri"/>
+                <w:b/>
+                <w:color w:val="0284C7"/>
+                <w:sz w:val="17"/>
+              </w:rPr>
+              <w:t>Performance Ratio Resultante</w:t>
+            </w:r>
+          </w:p>
+        </w:tc>
+        <w:tc>
+          <w:tcPr>
+            <w:tcW w:type="dxa" w:w="3120"/>
+            <w:shd w:fill="E0F2FE"/>
+            <w:tcMar>
+              <w:top w:w="80" w:type="dxa"/>
+              <w:bottom w:w="80" w:type="dxa"/>
+              <w:left w:w="120" w:type="dxa"/>
+              <w:right w:w="120" w:type="dxa"/>
+            </w:tcMar>
+            <w:vAlign w:val="center"/>
+          </w:tcPr>
+          <w:p>
+            <w:pPr>
+              <w:spacing w:before="40" w:after="40"/>
+            </w:pPr>
+            <w:r>
+              <w:rPr>
+                <w:rFonts w:ascii="Calibri" w:hAnsi="Calibri"/>
+                <w:b/>
+                <w:color w:val="0284C7"/>
+                <w:sz w:val="17"/>
+              </w:rPr>
+              <w:t>83.0% - 86.0%</w:t>
+            </w:r>
+          </w:p>
+        </w:tc>
+        <w:tc>
+          <w:tcPr>
+            <w:tcW w:type="dxa" w:w="3120"/>
+            <w:shd w:fill="E0F2FE"/>
+            <w:tcMar>
+              <w:top w:w="80" w:type="dxa"/>
+              <w:bottom w:w="80" w:type="dxa"/>
+              <w:left w:w="120" w:type="dxa"/>
+              <w:right w:w="120" w:type="dxa"/>
+            </w:tcMar>
+            <w:vAlign w:val="center"/>
+          </w:tcPr>
+          <w:p>
+            <w:pPr>
+              <w:spacing w:before="40" w:after="40"/>
+            </w:pPr>
+            <w:r>
+              <w:rPr>
+                <w:rFonts w:ascii="Calibri" w:hAnsi="Calibri"/>
+                <w:b/>
+                <w:color w:val="0284C7"/>
+                <w:sz w:val="17"/>
+              </w:rPr>
+              <w:t>PR = ∏ (1 - Pérdida_i). Rendimiento neto global del generador solar entregado a la red.</w:t>
+            </w:r>
+          </w:p>
+        </w:tc>
+      </w:tr>
+    </w:tbl>
+    <w:p>
+      <w:pPr>
+        <w:spacing w:after="120"/>
+      </w:pPr>
+    </w:p>
+    <w:p>
+      <w:pPr>
+        <w:pStyle w:val="Heading2"/>
+      </w:pPr>
+      <w:r>
+        <w:t>5.3. Modelo de Balance Energético y Autoconsumo</w:t>
+      </w:r>
+    </w:p>
+    <w:p>
+      <w:r>
+        <w:t>Para cada mes m del año (m = 1, ..., 12), el sistema determina la interacción con la red eléctrica:</w:t>
       </w:r>
     </w:p>
     <w:p>
@@ -4077,21 +4811,46 @@
       </w:pPr>
       <w:r>
         <w:rPr>
-          <w:b/>
-          <w:color w:val="009FE3"/>
-        </w:rPr>
-        <w:t>2. Tasa Interna de Retorno (TIR):</w:t>
-        <w:br/>
-      </w:r>
-      <w:r>
-        <w:rPr>
           <w:rFonts w:ascii="Consolas" w:hAnsi="Consolas"/>
           <w:color w:val="1E293B"/>
-          <w:sz w:val="19"/>
+          <w:sz w:val="18"/>
         </w:rPr>
-        <w:t>Tasa r* que satisface: VAN(r*) = 0.</w:t>
+        <w:t>1. Autoconsumo Solar Directo Mensual (kWh/mes):</w:t>
         <w:br/>
-        <w:t>El motor calcula la raíz mediante el algoritmo de bisección numérica con convergencia de 10^-7.</w:t>
+        <w:t xml:space="preserve">   E_auto,m = min( E_gen,m , E_con,m )</w:t>
+        <w:br/>
+        <w:br/>
+        <w:t>2. Excedente Solar Mensual a Red (kWh/mes):</w:t>
+        <w:br/>
+        <w:t xml:space="preserve">   E_exc,m = max( E_gen,m - E_con,m , 0 )</w:t>
+        <w:br/>
+        <w:br/>
+        <w:t>3. Energía Neta Importada de la Red (kWh/mes):</w:t>
+        <w:br/>
+        <w:t xml:space="preserve">   E_red,m = max( E_con,m - E_gen,m , 0 )</w:t>
+        <w:br/>
+        <w:br/>
+        <w:t>4. Grado de Cobertura Solar de la Demanda (%):</w:t>
+        <w:br/>
+        <w:t xml:space="preserve">   Cobertura (%) = [ ∑ E_auto,m / ∑ E_con,m ] × 100</w:t>
+        <w:br/>
+        <w:br/>
+        <w:t>5. Tasa de Aprovechamiento del Generador Solar (%):</w:t>
+        <w:br/>
+        <w:t xml:space="preserve">   Aprovechamiento (%) = [ ∑ E_auto,m / ∑ E_gen,m ] × 100</w:t>
+      </w:r>
+    </w:p>
+    <w:p>
+      <w:pPr>
+        <w:pStyle w:val="Heading2"/>
+      </w:pPr>
+      <w:r>
+        <w:t>5.4. Modelo de Simulación Horaria de 24 Horas y Almacenamiento con Baterías (BESS)</w:t>
+      </w:r>
+    </w:p>
+    <w:p>
+      <w:r>
+        <w:t>El motor modela la dinámica horaria (h = 0, ..., 23) superponiendo la campana solar con la curva de demanda del usuario y el ciclo de carga/descarga del banco de baterías:</w:t>
       </w:r>
     </w:p>
     <w:p>
@@ -4100,21 +4859,62 @@
       </w:pPr>
       <w:r>
         <w:rPr>
-          <w:b/>
-          <w:color w:val="009FE3"/>
-        </w:rPr>
-        <w:t>3. Costo Nivelado de la Energía (LCOE):</w:t>
-        <w:br/>
-      </w:r>
-      <w:r>
-        <w:rPr>
           <w:rFonts w:ascii="Consolas" w:hAnsi="Consolas"/>
           <w:color w:val="1E293B"/>
-          <w:sz w:val="19"/>
+          <w:sz w:val="18"/>
         </w:rPr>
-        <w:t>LCOE = [ CAPEX + ∑ (OPEX_t + Recambio_t)/(1+r)^t ] / [ ∑ Generacion_t/(1+r)^t ]</w:t>
+        <w:t>1. Generación Solar Horaria Media Diaria (kWh):</w:t>
         <w:br/>
-        <w:t>Permite comparar directamente el costo solar ($/kWh o USD/kWh) contra la tarifa de red.</w:t>
+        <w:t xml:space="preserve">   E_gen,h = (E_anual / 365) × f_solar,h</w:t>
+        <w:br/>
+        <w:t xml:space="preserve">   Donde f_solar es la campana de irradiancia centrada a las 13:00 hs.</w:t>
+        <w:br/>
+        <w:br/>
+        <w:t>2. Capacidad Útil del Banco de Baterías (kWh):</w:t>
+        <w:br/>
+        <w:t xml:space="preserve">   C_util = C_nominal × (DoD% / 100)    (Litio LFP: DoD 80-90%, Gel: DoD 50%)</w:t>
+        <w:br/>
+        <w:br/>
+        <w:t>3. Límite de Potencia de Carga/Descarga (kW - Régimen 0.5C):</w:t>
+        <w:br/>
+        <w:t xml:space="preserve">   P_bat,max = C_util / 2 h</w:t>
+        <w:br/>
+        <w:br/>
+        <w:t>4. Dinámica de Carga con Excedente Solar (11:00 a 15:00 hs):</w:t>
+        <w:br/>
+        <w:t xml:space="preserve">   Bat_carga,h = min( E_exc_bruto,h , C_util - SoC_h , P_bat,max )</w:t>
+        <w:br/>
+        <w:t xml:space="preserve">   SoC_h+1 = SoC_h + Bat_carga,h × η_carga    (η_carga = 95%)</w:t>
+        <w:br/>
+        <w:br/>
+        <w:t>5. Dinámica de Descarga en Horario Pico Nocturno (18:00 a 22:00 hs):</w:t>
+        <w:br/>
+        <w:t xml:space="preserve">   Bat_descarga,h = min( E_red_bruto,h , SoC_h , P_bat,max )</w:t>
+        <w:br/>
+        <w:t xml:space="preserve">   SoC_h+1 = SoC_h - Bat_descarga,h</w:t>
+        <w:br/>
+        <w:br/>
+        <w:t>6. Autoconsumo Total Integrado con Baterías:</w:t>
+        <w:br/>
+        <w:t xml:space="preserve">   E_auto_total,h = E_auto_directo,h + Bat_descarga,h</w:t>
+        <w:br/>
+        <w:br/>
+        <w:t>7. Autonomía del Sistema de Respaldo (Horas):</w:t>
+        <w:br/>
+        <w:t xml:space="preserve">   Autonomia = C_util / (E_con_anual / 8760 h)</w:t>
+      </w:r>
+    </w:p>
+    <w:p>
+      <w:pPr>
+        <w:pStyle w:val="Heading2"/>
+      </w:pPr>
+      <w:r>
+        <w:t>5.5. Algoritmos de Dimensionamiento Automatizado</w:t>
+      </w:r>
+    </w:p>
+    <w:p>
+      <w:r>
+        <w:t>El asistente de dimensionamiento implementa dos algoritmos matemáticos determinísticos:</w:t>
       </w:r>
     </w:p>
     <w:p>
@@ -4123,21 +4923,47 @@
       </w:pPr>
       <w:r>
         <w:rPr>
-          <w:b/>
-          <w:color w:val="009FE3"/>
-        </w:rPr>
-        <w:t>4. Payback con Interpolación Lineal:</w:t>
-        <w:br/>
-      </w:r>
-      <w:r>
-        <w:rPr>
           <w:rFonts w:ascii="Consolas" w:hAnsi="Consolas"/>
           <w:color w:val="1E293B"/>
-          <w:sz w:val="19"/>
+          <w:sz w:val="18"/>
         </w:rPr>
-        <w:t>Payback = (t - 1) + [ |Flujo_Acumulado_{t-1}| / Flujo_t ]</w:t>
+        <w:t>A. ALGORITMO POR SUPERFICIE DE CUBIERTA DISPONIBLE:</w:t>
         <w:br/>
-        <w:t>Calcula con precisión de fracción de año el momento exacto en que se recupera la inversión.</w:t>
+        <w:t xml:space="preserve">   1. Superficie útil efectiva:    A_util = A_techo × f_cubierta</w:t>
+        <w:br/>
+        <w:t xml:space="preserve">      (f_cubierta: Chapa coplanar = 0.75, Losa plana = 0.55, Teja = 0.65, Suelo = 0.50)</w:t>
+        <w:br/>
+        <w:t xml:space="preserve">   2. Módulos fotovoltaicos:       N_paneles = ⌊ A_util / 2.58 m² ⌋   (Panel tipo 575 Wp)</w:t>
+        <w:br/>
+        <w:t xml:space="preserve">   3. Potencia pico instalable:    P_kWp = (N_paneles × 575 Wp) / 1000</w:t>
+        <w:br/>
+        <w:t xml:space="preserve">   4. Sobrecarga estática total:   W_total = N_paneles × 28.5 kg + A_util × (w_cubierta - 11 kg/m²)</w:t>
+        <w:br/>
+        <w:br/>
+        <w:t>B. ALGORITMO POR OBJETIVO DE COBERTURA ENERGÉTICA (%):</w:t>
+        <w:br/>
+        <w:t xml:space="preserve">   1. Energía objetivo anual:      E_obj = E_con_anual × (Cobertura% / 100)</w:t>
+        <w:br/>
+        <w:t xml:space="preserve">   2. Rendimiento específico sitio: Yield = H_anual × (PR / 100)</w:t>
+        <w:br/>
+        <w:t xml:space="preserve">   3. Potencia pico requerida:     P_kWp_req = E_obj / Yield</w:t>
+        <w:br/>
+        <w:t xml:space="preserve">   4. Cantidad entera de paneles:  N_paneles = ⌈ (P_kWp_req × 1000) / P_panel ⌉</w:t>
+        <w:br/>
+        <w:t xml:space="preserve">   5. Superficie de techo mínima:  A_min = (N_paneles × 2.58 m²) / f_cubierta</w:t>
+      </w:r>
+    </w:p>
+    <w:p>
+      <w:pPr>
+        <w:pStyle w:val="Heading2"/>
+      </w:pPr>
+      <w:r>
+        <w:t>5.6. Modelo Tarifario e Impuestos Eléctricos</w:t>
+      </w:r>
+    </w:p>
+    <w:p>
+      <w:r>
+        <w:t>El ahorro monetario del cliente se calcula valorizando el autoconsumo a la tarifa completa con impuestos:</w:t>
       </w:r>
     </w:p>
     <w:p>
@@ -4146,23 +4972,36 @@
       </w:pPr>
       <w:r>
         <w:rPr>
-          <w:b/>
-          <w:color w:val="009FE3"/>
-        </w:rPr>
-        <w:t>5. Degradación e Inflación Compuesta:</w:t>
-        <w:br/>
-      </w:r>
-      <w:r>
-        <w:rPr>
           <w:rFonts w:ascii="Consolas" w:hAnsi="Consolas"/>
           <w:color w:val="1E293B"/>
-          <w:sz w:val="19"/>
+          <w:sz w:val="18"/>
         </w:rPr>
-        <w:t>Generacion_t = Generacion_1 × (1 - d)^(t-1)</w:t>
+        <w:t>1. Tarifa Plena con Impuestos ($/kWh):</w:t>
         <w:br/>
-        <w:t>Ahorro_t = Ahorro_1 × (1 - d)^(t-1) × (1 + inf)^(t-1)</w:t>
+        <w:t xml:space="preserve">   T_full = T_base × [ 1 + ( ∑ Impuestos% ) / 100 ]</w:t>
         <w:br/>
-        <w:t>Donde d es la degradación anual (ej: 0.5%/año) e inf es el aumento tarifario anual.</w:t>
+        <w:br/>
+        <w:t>2. Ahorro Económico del Año 1 ($/año):</w:t>
+        <w:br/>
+        <w:t xml:space="preserve">   Ahorro_1 = ∑ [ E_auto,m × T_full + E_exc,m × T_inyeccion ]   (para m = 1..12)</w:t>
+        <w:br/>
+        <w:br/>
+        <w:t>3. Ahorro Anual Año 1 en Dólares (USD/año):</w:t>
+        <w:br/>
+        <w:t xml:space="preserve">   Ahorro_1_USD = Ahorro_1 / Tipo_de_Cambio</w:t>
+      </w:r>
+    </w:p>
+    <w:p>
+      <w:pPr>
+        <w:pStyle w:val="Heading2"/>
+      </w:pPr>
+      <w:r>
+        <w:t>5.7. Modelo Financiero de Compra Directa (Flujo de Fondos, VAN, TIR, Payback y LCOE)</w:t>
+      </w:r>
+    </w:p>
+    <w:p>
+      <w:r>
+        <w:t>Modela el flujo de caja dinámico a lo largo de 20 a 30 años incorporando degradación de celdas, inflación energética, OPEX y recambio de inversores:</w:t>
       </w:r>
     </w:p>
     <w:p>
@@ -4171,21 +5010,63 @@
       </w:pPr>
       <w:r>
         <w:rPr>
-          <w:b/>
-          <w:color w:val="009FE3"/>
-        </w:rPr>
-        <w:t>6. Autonomía del Banco de Baterías (BESS):</w:t>
-        <w:br/>
-      </w:r>
-      <w:r>
-        <w:rPr>
           <w:rFonts w:ascii="Consolas" w:hAnsi="Consolas"/>
           <w:color w:val="1E293B"/>
-          <w:sz w:val="19"/>
+          <w:sz w:val="18"/>
         </w:rPr>
-        <w:t>Capacidad_Util = Capacidad_Nominal × (DoD % / 100)</w:t>
+        <w:t>1. Inversión Inicial Total (CAPEX):</w:t>
         <w:br/>
-        <w:t>Autonomia_Horas = Capacidad_Util / Demanda_Media_Horaria</w:t>
+        <w:t xml:space="preserve">   CAPEX_USD = (P_kWp × Costo_kWp) + (C_bat_kWh × Costo_bat_kWh)</w:t>
+        <w:br/>
+        <w:t xml:space="preserve">   CAPEX_ARS = CAPEX_USD × Tipo_de_Cambio</w:t>
+        <w:br/>
+        <w:br/>
+        <w:t>2. Flujo de Fondos del Año t (t = 1, 2, ..., N):</w:t>
+        <w:br/>
+        <w:t xml:space="preserve">   • Generación año t:       E_gen,t = E_anual × (1 - d)^(t-1)          (d: degradación anual ~0.5%)</w:t>
+        <w:br/>
+        <w:t xml:space="preserve">   • Ahorro energético t:    Ahorro_t = Ahorro_1 × (1 - d)^(t-1) × (1 + inf)^(t-1)   (inf: inflación anual)</w:t>
+        <w:br/>
+        <w:t xml:space="preserve">   • Gasto OPEX año t:       OPEX_t = CAPEX_ARS × (OPEX% / 100) × (1 + inf)^(t-1)</w:t>
+        <w:br/>
+        <w:t xml:space="preserve">   • Recambio Inversor t:    Recambio_t = CAPEX_ARS × (Recambio% / 100) × (1 + inf)^(t-1)  (si t mod k = 0)</w:t>
+        <w:br/>
+        <w:t xml:space="preserve">   • Flujo Neto Nominal:     Flujo_t = Ahorro_t - OPEX_t - Recambio_t</w:t>
+        <w:br/>
+        <w:br/>
+        <w:t>3. Valor Actual Neto (VAN):</w:t>
+        <w:br/>
+        <w:t xml:space="preserve">   VAN = -CAPEX + ∑ [ Flujo_t / (1 + r)^t ]    (r: tasa de descuento WACC)</w:t>
+        <w:br/>
+        <w:br/>
+        <w:t>4. Tasa Interna de Retorno (TIR):</w:t>
+        <w:br/>
+        <w:t xml:space="preserve">   Tasa r* que satisface la ecuación no lineal: VAN(r*) = 0</w:t>
+        <w:br/>
+        <w:t xml:space="preserve">   (Calculada numéricamente mediante algoritmo de bisección con convergencia |f(r)| &lt; 10^-7).</w:t>
+        <w:br/>
+        <w:br/>
+        <w:t>5. Período de Recupero de la Inversión (Payback Simple con Interpolación Lineal):</w:t>
+        <w:br/>
+        <w:t xml:space="preserve">   Payback = (t - 1) + [ |Flujo_Acumulado_{t-1}| / Flujo_t ]</w:t>
+        <w:br/>
+        <w:br/>
+        <w:t>6. Costo Nivelado de la Energía (LCOE - Levelized Cost of Energy):</w:t>
+        <w:br/>
+        <w:t xml:space="preserve">   LCOE = [ CAPEX + ∑ ( (OPEX_t + Recambio_t) / (1 + r)^t ) ] / [ ∑ ( E_gen,t / (1 + r)^t ) ]</w:t>
+      </w:r>
+    </w:p>
+    <w:p>
+      <w:pPr>
+        <w:pStyle w:val="Heading2"/>
+      </w:pPr>
+      <w:r>
+        <w:t>5.8. Modelo Financiero de Leasing Solar y Escudo Fiscal</w:t>
+      </w:r>
+    </w:p>
+    <w:p>
+      <w:r>
+        <w:t>Modela el contrato de leasing operativo/financiero y cuantifica el beneficio impositivo en Ganancias:</w:t>
       </w:r>
     </w:p>
     <w:p>
@@ -4194,21 +5075,117 @@
       </w:pPr>
       <w:r>
         <w:rPr>
-          <w:b/>
-          <w:color w:val="009FE3"/>
+          <w:rFonts w:ascii="Consolas" w:hAnsi="Consolas"/>
+          <w:color w:val="1E293B"/>
+          <w:sz w:val="18"/>
         </w:rPr>
-        <w:t>7. Escudo Fiscal del Leasing en Ganancias:</w:t>
+        <w:t>1. Canon Mensual de Leasing (USD/mes):</w:t>
         <w:br/>
+        <w:t xml:space="preserve">   Canon_mes = Canon_unitario_kWp × P_kWp</w:t>
+        <w:br/>
+        <w:br/>
+        <w:t>2. Costo Total Bruto del Contrato de Leasing (USD):</w:t>
+        <w:br/>
+        <w:t xml:space="preserve">   Costo_bruto = Pago_Inicial + (Canon_mes × Plazo_meses) + ∑ Seguros + ∑ Mantenimientos + Opcion_Compra</w:t>
+        <w:br/>
+        <w:br/>
+        <w:t>3. Escudo Fiscal en Impuesto a las Ganancias (USD):</w:t>
+        <w:br/>
+        <w:t xml:space="preserve">   Gasto_Deducible = (Canon_mes × Plazo_meses) + ∑ Seguros + ∑ Mantenimientos</w:t>
+        <w:br/>
+        <w:t xml:space="preserve">   Ahorro_Ganancias = Gasto_Deducible × (Alícuota_Ganancias / 100)    (Alícuota: 30% o 35%)</w:t>
+        <w:br/>
+        <w:br/>
+        <w:t>4. Costo Neto Efectivo del Leasing (USD):</w:t>
+        <w:br/>
+        <w:t xml:space="preserve">   Costo_neto = Costo_bruto - Ahorro_Ganancias</w:t>
+        <w:br/>
+        <w:br/>
+        <w:t>5. Flujo Mensual Neto Operativo (USD/mes):</w:t>
+        <w:br/>
+        <w:t xml:space="preserve">   Flujo_mes = Ahorro_Solar_mes - [ Canon_mes + (Seguro_anual + Mtto_anual) / 12 ]</w:t>
+        <w:br/>
+        <w:t xml:space="preserve">   (Si Flujo_mes &gt; 0, el sistema genera excedente de caja positivo desde el primer mes).</w:t>
       </w:r>
+    </w:p>
+    <w:p>
+      <w:pPr>
+        <w:pStyle w:val="Heading2"/>
+      </w:pPr>
+      <w:r>
+        <w:t>5.9. Modelo de Análisis de Sensibilidad Bidimensional</w:t>
+      </w:r>
+    </w:p>
+    <w:p>
+      <w:r>
+        <w:t>Construye matrices matriciales cruzadas de evaluación de riesgo evaluando simultáneamente dos perturbaciones:</w:t>
+      </w:r>
+    </w:p>
+    <w:p>
+      <w:pPr>
+        <w:spacing w:after="120"/>
+      </w:pPr>
       <w:r>
         <w:rPr>
           <w:rFonts w:ascii="Consolas" w:hAnsi="Consolas"/>
           <w:color w:val="1E293B"/>
-          <w:sz w:val="19"/>
+          <w:sz w:val="18"/>
         </w:rPr>
-        <w:t>Ahorro_Impositivo = (∑ Canones + ∑ Seguros + ∑ Mantenimientos) × Alícuota_Ganancias</w:t>
+        <w:t>1. Matriz Tarifa Eléctrica vs. CAPEX:</w:t>
         <w:br/>
-        <w:t>Costo_Neto = Pago_Inicial + ∑ Canones + ∑ Seguros + ∑ Mtto + Opcion_Compra − Ahorro_Impositivo</w:t>
+        <w:t xml:space="preserve">   Grid de 5 × 5 nodos: ΔTarifa ∈ {-20%, -10%, 0%, +10%, +20%}  ×  ΔCAPEX ∈ {-15%, -10%, 0%, +10%, +15%}</w:t>
+        <w:br/>
+        <w:t xml:space="preserve">   Para cada nodo (i, j), el motor recalcula el modelo completo y extrae: VAN, TIR y Payback.</w:t>
+        <w:br/>
+        <w:br/>
+        <w:t>2. Matriz Inflación Tarifaria vs. Tasa de Descuento (WACC):</w:t>
+        <w:br/>
+        <w:t xml:space="preserve">   Grid de 5 × 4 nodos: WACC ∈ {6%, 8%, 10%, 12%, 15%}  ×  ΔInflación ∈ {-5%, 0%, +5%, +10%}</w:t>
+        <w:br/>
+        <w:t xml:space="preserve">   Permite identificar el umbral de viabilidad (puntos donde VAN &gt; 0 y TIR &gt; WACC).</w:t>
+      </w:r>
+    </w:p>
+    <w:p>
+      <w:pPr>
+        <w:pStyle w:val="Heading2"/>
+      </w:pPr>
+      <w:r>
+        <w:t>5.10. Modelo de Descarbonización e Impacto Ambiental (ESG)</w:t>
+      </w:r>
+    </w:p>
+    <w:p>
+      <w:r>
+        <w:t>Cuantifica los beneficios ecológicos a partir del factor de emisión de la matriz eléctrica argentina (SADI):</w:t>
+      </w:r>
+    </w:p>
+    <w:p>
+      <w:pPr>
+        <w:spacing w:after="120"/>
+      </w:pPr>
+      <w:r>
+        <w:rPr>
+          <w:rFonts w:ascii="Consolas" w:hAnsi="Consolas"/>
+          <w:color w:val="1E293B"/>
+          <w:sz w:val="18"/>
+        </w:rPr>
+        <w:t>1. Toneladas de CO₂ Evitadas Anualmente (Ton CO₂/año):</w:t>
+        <w:br/>
+        <w:t xml:space="preserve">   CO2_anual = ( E_anual × FE_red ) / 1000      (FE_red = 0.45 kg CO₂/kWh - Factor SADI CAMMESA)</w:t>
+        <w:br/>
+        <w:br/>
+        <w:t>2. Toneladas de CO₂ Evitadas en la Vida Útil (Ton CO₂ Total):</w:t>
+        <w:br/>
+        <w:t xml:space="preserve">   CO2_total = [ ( ∑ E_gen,t ) × FE_red ] / 1000</w:t>
+        <w:br/>
+        <w:br/>
+        <w:t>3. Árboles Plantados Equivalentes:</w:t>
+        <w:br/>
+        <w:t xml:space="preserve">   Arboles_Eq = ( CO2_anual × 1000 kg ) / 21.7 kg CO₂/árbol/año</w:t>
+        <w:br/>
+        <w:br/>
+        <w:t>4. Kilómetros no Emitidos en Automóvil Convencional:</w:t>
+        <w:br/>
+        <w:t xml:space="preserve">   Km_Auto_Eq = ( CO2_anual × 1000 kg ) / 0.19 kg CO₂/km</w:t>
       </w:r>
     </w:p>
     <w:p>

</xml_diff>

<commit_message>
feat(techo3d): agregar pestana de diseno satelital 3D, sombreado ray-casting y cierre express en 90s
</commit_message>
<xml_diff>
--- a/Manual_de_Usuario_Simulador_FV_ALP_GROUP.docx
+++ b/Manual_de_Usuario_Simulador_FV_ALP_GROUP.docx
@@ -538,7 +538,7 @@
                 <w:color w:val="334155"/>
                 <w:sz w:val="20"/>
               </w:rPr>
-              <w:t>3. Guía Paso a Paso de las 7 Pestañas de Análisis</w:t>
+              <w:t>3. Guía Paso a Paso de las Pestañas de Análisis</w:t>
             </w:r>
           </w:p>
         </w:tc>
@@ -652,7 +652,7 @@
                 <w:color w:val="334155"/>
                 <w:sz w:val="20"/>
               </w:rPr>
-              <w:t xml:space="preserve">   3.2. Pestaña ⚡ Energía, CO₂ y Desglose de Pérdidas Técnicas</w:t>
+              <w:t xml:space="preserve">   3.2. Pestaña 🛰️ Techo &amp; 3D (Diseño Satelital y Cierre Express en 90s)</w:t>
             </w:r>
           </w:p>
         </w:tc>
@@ -680,7 +680,7 @@
                 <w:color w:val="334155"/>
                 <w:sz w:val="20"/>
               </w:rPr>
-              <w:t>7</w:t>
+              <w:t>6</w:t>
             </w:r>
           </w:p>
         </w:tc>
@@ -709,7 +709,7 @@
                 <w:color w:val="334155"/>
                 <w:sz w:val="20"/>
               </w:rPr>
-              <w:t xml:space="preserve">   3.3. Pestaña 📈 Resultados Económicos (Compra Directa)</w:t>
+              <w:t xml:space="preserve">   3.3. Pestaña ⚡ Energía, CO₂ y Desglose de Pérdidas Técnicas</w:t>
             </w:r>
           </w:p>
         </w:tc>
@@ -766,7 +766,7 @@
                 <w:color w:val="334155"/>
                 <w:sz w:val="20"/>
               </w:rPr>
-              <w:t xml:space="preserve">   3.4. Pestaña 🏦 Leasing vs. Compra al Contado</w:t>
+              <w:t xml:space="preserve">   3.4. Pestaña 📈 Resultados Económicos (Compra Directa)</w:t>
             </w:r>
           </w:p>
         </w:tc>
@@ -823,7 +823,7 @@
                 <w:color w:val="334155"/>
                 <w:sz w:val="20"/>
               </w:rPr>
-              <w:t xml:space="preserve">   3.5. Pestaña 🎯 Análisis de Sensibilidad y Matrices de Riesgo</w:t>
+              <w:t xml:space="preserve">   3.5. Pestaña 🏦 Leasing vs. Compra al Contado</w:t>
             </w:r>
           </w:p>
         </w:tc>
@@ -880,7 +880,7 @@
                 <w:color w:val="334155"/>
                 <w:sz w:val="20"/>
               </w:rPr>
-              <w:t xml:space="preserve">   3.6. Pestaña ⚖️ Comparador Multi-Proyecto Lado a Lado</w:t>
+              <w:t xml:space="preserve">   3.6. Pestaña 🎯 Análisis de Sensibilidad y Matrices de Riesgo</w:t>
             </w:r>
           </w:p>
         </w:tc>
@@ -937,7 +937,7 @@
                 <w:color w:val="334155"/>
                 <w:sz w:val="20"/>
               </w:rPr>
-              <w:t xml:space="preserve">   3.7. Pestaña 📄 Propuesta Comercial Ejecutiva (Cotización para Clientes)</w:t>
+              <w:t xml:space="preserve">   3.7. Pestaña ⚖️ Comparador Multi-Proyecto Lado a Lado</w:t>
             </w:r>
           </w:p>
         </w:tc>
@@ -965,7 +965,64 @@
                 <w:color w:val="334155"/>
                 <w:sz w:val="20"/>
               </w:rPr>
-              <w:t>11</w:t>
+              <w:t>12</w:t>
+            </w:r>
+          </w:p>
+        </w:tc>
+      </w:tr>
+      <w:tr>
+        <w:tc>
+          <w:tcPr>
+            <w:tcW w:type="dxa" w:w="8352"/>
+            <w:shd w:fill="FFFFFF"/>
+            <w:tcMar>
+              <w:top w:w="80" w:type="dxa"/>
+              <w:bottom w:w="80" w:type="dxa"/>
+              <w:left w:w="120" w:type="dxa"/>
+              <w:right w:w="120" w:type="dxa"/>
+            </w:tcMar>
+            <w:vAlign w:val="center"/>
+          </w:tcPr>
+          <w:p>
+            <w:pPr>
+              <w:spacing w:before="40" w:after="40"/>
+            </w:pPr>
+            <w:r>
+              <w:rPr>
+                <w:rFonts w:ascii="Calibri" w:hAnsi="Calibri"/>
+                <w:b w:val="0"/>
+                <w:color w:val="334155"/>
+                <w:sz w:val="20"/>
+              </w:rPr>
+              <w:t xml:space="preserve">   3.8. Pestaña 📄 Propuesta Comercial Ejecutiva (Cotización para Clientes)</w:t>
+            </w:r>
+          </w:p>
+        </w:tc>
+        <w:tc>
+          <w:tcPr>
+            <w:tcW w:type="dxa" w:w="1008"/>
+            <w:shd w:fill="FFFFFF"/>
+            <w:tcMar>
+              <w:top w:w="80" w:type="dxa"/>
+              <w:bottom w:w="80" w:type="dxa"/>
+              <w:left w:w="120" w:type="dxa"/>
+              <w:right w:w="120" w:type="dxa"/>
+            </w:tcMar>
+            <w:vAlign w:val="center"/>
+          </w:tcPr>
+          <w:p>
+            <w:pPr>
+              <w:spacing w:before="40" w:after="40"/>
+              <w:jc w:val="right"/>
+            </w:pPr>
+            <w:r>
+              <w:rPr>
+                <w:rFonts w:ascii="Calibri" w:hAnsi="Calibri"/>
+                <w:b w:val="0"/>
+                <w:color w:val="334155"/>
+                <w:sz w:val="20"/>
+              </w:rPr>
+              <w:t>12</w:t>
             </w:r>
           </w:p>
         </w:tc>
@@ -1022,7 +1079,7 @@
                 <w:color w:val="334155"/>
                 <w:sz w:val="20"/>
               </w:rPr>
-              <w:t>12</w:t>
+              <w:t>13</w:t>
             </w:r>
           </w:p>
         </w:tc>
@@ -1079,7 +1136,7 @@
                 <w:color w:val="334155"/>
                 <w:sz w:val="20"/>
               </w:rPr>
-              <w:t>13</w:t>
+              <w:t>14</w:t>
             </w:r>
           </w:p>
         </w:tc>
@@ -1136,7 +1193,7 @@
                 <w:color w:val="334155"/>
                 <w:sz w:val="20"/>
               </w:rPr>
-              <w:t>15</w:t>
+              <w:t>16</w:t>
             </w:r>
           </w:p>
         </w:tc>
@@ -2198,7 +2255,374 @@
         <w:pStyle w:val="Heading2"/>
       </w:pPr>
       <w:r>
-        <w:t>3.2. Pestaña ⚡ Energía, CO₂ y Desglose de Pérdidas Técnicas</w:t>
+        <w:t>3.2. Pestaña 🛰️ Techo &amp; 3D (Diseño Satelital y Cierre Express en 90s)</w:t>
+      </w:r>
+    </w:p>
+    <w:p>
+      <w:r>
+        <w:t>Esta pestaña incorpora tecnología de vanguardia para cotizaciones inmediatas en campo (tablets) y presentaciones comerciales en videollamada. Permite realizar en solo 90 segundos lo que tradicionalmente demandaba visitas técnicas previas y software CAD complejo, integrando cuatro pilares tecnológicos:</w:t>
+      </w:r>
+    </w:p>
+    <w:tbl>
+      <w:tblPr>
+        <w:tblW w:type="auto" w:w="0"/>
+        <w:jc w:val="center"/>
+        <w:tblLook w:firstColumn="1" w:firstRow="1" w:lastColumn="0" w:lastRow="0" w:noHBand="0" w:noVBand="1" w:val="04A0"/>
+      </w:tblPr>
+      <w:tblGrid>
+        <w:gridCol w:w="3168"/>
+        <w:gridCol w:w="6192"/>
+      </w:tblGrid>
+      <w:tr>
+        <w:tc>
+          <w:tcPr>
+            <w:tcW w:type="dxa" w:w="4680"/>
+            <w:shd w:fill="009FE3"/>
+            <w:tcMar>
+              <w:top w:w="80" w:type="dxa"/>
+              <w:bottom w:w="80" w:type="dxa"/>
+              <w:left w:w="120" w:type="dxa"/>
+              <w:right w:w="120" w:type="dxa"/>
+            </w:tcMar>
+            <w:vAlign w:val="center"/>
+          </w:tcPr>
+          <w:p>
+            <w:pPr>
+              <w:spacing w:before="40" w:after="40"/>
+            </w:pPr>
+            <w:r>
+              <w:rPr>
+                <w:rFonts w:ascii="Calibri" w:hAnsi="Calibri"/>
+                <w:b/>
+                <w:color w:val="FFFFFF"/>
+                <w:sz w:val="19"/>
+              </w:rPr>
+              <w:t>Pilar Tecnológico</w:t>
+            </w:r>
+          </w:p>
+        </w:tc>
+        <w:tc>
+          <w:tcPr>
+            <w:tcW w:type="dxa" w:w="4680"/>
+            <w:shd w:fill="009FE3"/>
+            <w:tcMar>
+              <w:top w:w="80" w:type="dxa"/>
+              <w:bottom w:w="80" w:type="dxa"/>
+              <w:left w:w="120" w:type="dxa"/>
+              <w:right w:w="120" w:type="dxa"/>
+            </w:tcMar>
+            <w:vAlign w:val="center"/>
+          </w:tcPr>
+          <w:p>
+            <w:pPr>
+              <w:spacing w:before="40" w:after="40"/>
+            </w:pPr>
+            <w:r>
+              <w:rPr>
+                <w:rFonts w:ascii="Calibri" w:hAnsi="Calibri"/>
+                <w:b/>
+                <w:color w:val="FFFFFF"/>
+                <w:sz w:val="19"/>
+              </w:rPr>
+              <w:t>Implementación en ALP GROUP Simulador FV</w:t>
+            </w:r>
+          </w:p>
+        </w:tc>
+      </w:tr>
+      <w:tr>
+        <w:tc>
+          <w:tcPr>
+            <w:tcW w:type="dxa" w:w="4680"/>
+            <w:shd w:fill="F8FAFC"/>
+            <w:tcMar>
+              <w:top w:w="80" w:type="dxa"/>
+              <w:bottom w:w="80" w:type="dxa"/>
+              <w:left w:w="120" w:type="dxa"/>
+              <w:right w:w="120" w:type="dxa"/>
+            </w:tcMar>
+            <w:vAlign w:val="center"/>
+          </w:tcPr>
+          <w:p>
+            <w:pPr>
+              <w:spacing w:before="40" w:after="40"/>
+            </w:pPr>
+            <w:r>
+              <w:rPr>
+                <w:rFonts w:ascii="Calibri" w:hAnsi="Calibri"/>
+                <w:b/>
+                <w:color w:val="334155"/>
+                <w:sz w:val="18"/>
+              </w:rPr>
+              <w:t>1. Visión y Detección de Techos</w:t>
+            </w:r>
+          </w:p>
+        </w:tc>
+        <w:tc>
+          <w:tcPr>
+            <w:tcW w:type="dxa" w:w="4680"/>
+            <w:shd w:fill="F8FAFC"/>
+            <w:tcMar>
+              <w:top w:w="80" w:type="dxa"/>
+              <w:bottom w:w="80" w:type="dxa"/>
+              <w:left w:w="120" w:type="dxa"/>
+              <w:right w:w="120" w:type="dxa"/>
+            </w:tcMar>
+            <w:vAlign w:val="center"/>
+          </w:tcPr>
+          <w:p>
+            <w:pPr>
+              <w:spacing w:before="40" w:after="40"/>
+            </w:pPr>
+            <w:r>
+              <w:rPr>
+                <w:rFonts w:ascii="Calibri" w:hAnsi="Calibri"/>
+                <w:b w:val="0"/>
+                <w:color w:val="334155"/>
+                <w:sz w:val="18"/>
+              </w:rPr>
+              <w:t>Mosaico satelital de alta resolución (Esri World Imagery) y geocodificación de calles/parques industriales (OSM Nominatim). Herramienta de polígono interactivo para delimitar cubiertas, cálculo automático de azimut óptimo y gestor interactivo de obstáculos (Árboles, Chimeneas, Climatizadores HVAC, Domos/Tragaluces y Antenas) con radios y alturas configurables.</w:t>
+            </w:r>
+          </w:p>
+        </w:tc>
+      </w:tr>
+      <w:tr>
+        <w:tc>
+          <w:tcPr>
+            <w:tcW w:type="dxa" w:w="4680"/>
+            <w:shd w:fill="FFFFFF"/>
+            <w:tcMar>
+              <w:top w:w="80" w:type="dxa"/>
+              <w:bottom w:w="80" w:type="dxa"/>
+              <w:left w:w="120" w:type="dxa"/>
+              <w:right w:w="120" w:type="dxa"/>
+            </w:tcMar>
+            <w:vAlign w:val="center"/>
+          </w:tcPr>
+          <w:p>
+            <w:pPr>
+              <w:spacing w:before="40" w:after="40"/>
+            </w:pPr>
+            <w:r>
+              <w:rPr>
+                <w:rFonts w:ascii="Calibri" w:hAnsi="Calibri"/>
+                <w:b/>
+                <w:color w:val="334155"/>
+                <w:sz w:val="18"/>
+              </w:rPr>
+              <w:t>2. Auto-Layout Inteligente y Tipos de Cubierta</w:t>
+            </w:r>
+          </w:p>
+        </w:tc>
+        <w:tc>
+          <w:tcPr>
+            <w:tcW w:type="dxa" w:w="4680"/>
+            <w:shd w:fill="FFFFFF"/>
+            <w:tcMar>
+              <w:top w:w="80" w:type="dxa"/>
+              <w:bottom w:w="80" w:type="dxa"/>
+              <w:left w:w="120" w:type="dxa"/>
+              <w:right w:w="120" w:type="dxa"/>
+            </w:tcMar>
+            <w:vAlign w:val="center"/>
+          </w:tcPr>
+          <w:p>
+            <w:pPr>
+              <w:spacing w:before="40" w:after="40"/>
+            </w:pPr>
+            <w:r>
+              <w:rPr>
+                <w:rFonts w:ascii="Calibri" w:hAnsi="Calibri"/>
+                <w:b w:val="0"/>
+                <w:color w:val="334155"/>
+                <w:sz w:val="18"/>
+              </w:rPr>
+              <w:t>Algoritmo de empaquetado reticular que calcula la cantidad máxima de módulos (paneles de 575 Wp monocristalinos), potencia pico kWp instalable y factor de ocupación respetando pasillos perimetrales. Soporta cubiertas a Dos Aguas (cumbrera central), Un Agua (monopendiente) y Losa Plana (con muro parapeto perimetral y caballetes de aluminio elevados con espaciado anti-sombras calculado para el solsticio de invierno).</w:t>
+            </w:r>
+          </w:p>
+        </w:tc>
+      </w:tr>
+      <w:tr>
+        <w:tc>
+          <w:tcPr>
+            <w:tcW w:type="dxa" w:w="4680"/>
+            <w:shd w:fill="F8FAFC"/>
+            <w:tcMar>
+              <w:top w:w="80" w:type="dxa"/>
+              <w:bottom w:w="80" w:type="dxa"/>
+              <w:left w:w="120" w:type="dxa"/>
+              <w:right w:w="120" w:type="dxa"/>
+            </w:tcMar>
+            <w:vAlign w:val="center"/>
+          </w:tcPr>
+          <w:p>
+            <w:pPr>
+              <w:spacing w:before="40" w:after="40"/>
+            </w:pPr>
+            <w:r>
+              <w:rPr>
+                <w:rFonts w:ascii="Calibri" w:hAnsi="Calibri"/>
+                <w:b/>
+                <w:color w:val="334155"/>
+                <w:sz w:val="18"/>
+              </w:rPr>
+              <w:t>3. Gemelo 3D, Cámaras y Sombras por Trazado de Rayos</w:t>
+            </w:r>
+          </w:p>
+        </w:tc>
+        <w:tc>
+          <w:tcPr>
+            <w:tcW w:type="dxa" w:w="4680"/>
+            <w:shd w:fill="F8FAFC"/>
+            <w:tcMar>
+              <w:top w:w="80" w:type="dxa"/>
+              <w:bottom w:w="80" w:type="dxa"/>
+              <w:left w:w="120" w:type="dxa"/>
+              <w:right w:w="120" w:type="dxa"/>
+            </w:tcMar>
+            <w:vAlign w:val="center"/>
+          </w:tcPr>
+          <w:p>
+            <w:pPr>
+              <w:spacing w:before="40" w:after="40"/>
+            </w:pPr>
+            <w:r>
+              <w:rPr>
+                <w:rFonts w:ascii="Calibri" w:hAnsi="Calibri"/>
+                <w:b w:val="0"/>
+                <w:color w:val="334155"/>
+                <w:sz w:val="18"/>
+              </w:rPr>
+              <w:t>Motor gráfico WebGL interactivo (Three.js) con presets de cámara instantáneos (🛰️ Planta Cenital, 📐 Isométrica 45°, 🌅 Frontal/Rasante y 🔄 Reset). Posicionamiento astronómico del sol (Duffie &amp; Beckman) con slider de hora (06:00 a 19:00 hs) y mes. Incorpora simulación de sombras por Ray-Casting en tiempo real: los módulos bajo sombra se oscurecen dinámicamente en 3D y se calcula el porcentaje de atenuación actual y la pérdida anual estimada (% derate).</w:t>
+            </w:r>
+          </w:p>
+        </w:tc>
+      </w:tr>
+      <w:tr>
+        <w:tc>
+          <w:tcPr>
+            <w:tcW w:type="dxa" w:w="4680"/>
+            <w:shd w:fill="FFFFFF"/>
+            <w:tcMar>
+              <w:top w:w="80" w:type="dxa"/>
+              <w:bottom w:w="80" w:type="dxa"/>
+              <w:left w:w="120" w:type="dxa"/>
+              <w:right w:w="120" w:type="dxa"/>
+            </w:tcMar>
+            <w:vAlign w:val="center"/>
+          </w:tcPr>
+          <w:p>
+            <w:pPr>
+              <w:spacing w:before="40" w:after="40"/>
+            </w:pPr>
+            <w:r>
+              <w:rPr>
+                <w:rFonts w:ascii="Calibri" w:hAnsi="Calibri"/>
+                <w:b/>
+                <w:color w:val="334155"/>
+                <w:sz w:val="18"/>
+              </w:rPr>
+              <w:t>4. Conexión Climática &amp; Cierre 90s</w:t>
+            </w:r>
+          </w:p>
+        </w:tc>
+        <w:tc>
+          <w:tcPr>
+            <w:tcW w:type="dxa" w:w="4680"/>
+            <w:shd w:fill="FFFFFF"/>
+            <w:tcMar>
+              <w:top w:w="80" w:type="dxa"/>
+              <w:bottom w:w="80" w:type="dxa"/>
+              <w:left w:w="120" w:type="dxa"/>
+              <w:right w:w="120" w:type="dxa"/>
+            </w:tcMar>
+            <w:vAlign w:val="center"/>
+          </w:tcPr>
+          <w:p>
+            <w:pPr>
+              <w:spacing w:before="40" w:after="40"/>
+            </w:pPr>
+            <w:r>
+              <w:rPr>
+                <w:rFonts w:ascii="Calibri" w:hAnsi="Calibri"/>
+                <w:b w:val="0"/>
+                <w:color w:val="334155"/>
+                <w:sz w:val="18"/>
+              </w:rPr>
+              <w:t>Conexión a la API satelital de NASA POWER para radiación histórica y comparador financiero express: Ahorro mensual en factura eléctrica vs. Cuota del leasing no bancario de ALP Group, con cálculo de flujo neto, envío directo a WhatsApp, descarga de render 3D y volcador integral al proyecto (incluyendo pérdidas por sombras calculadas).</w:t>
+            </w:r>
+          </w:p>
+        </w:tc>
+      </w:tr>
+    </w:tbl>
+    <w:tbl>
+      <w:tblPr>
+        <w:tblW w:type="auto" w:w="0"/>
+        <w:jc w:val="center"/>
+        <w:tblLayout w:type="fixed"/>
+        <w:tblLook w:firstColumn="1" w:firstRow="1" w:lastColumn="0" w:lastRow="0" w:noHBand="0" w:noVBand="1" w:val="04A0"/>
+      </w:tblPr>
+      <w:tblGrid>
+        <w:gridCol w:w="9360"/>
+      </w:tblGrid>
+      <w:tr>
+        <w:tc>
+          <w:tcPr>
+            <w:tcW w:type="dxa" w:w="9360"/>
+            <w:shd w:fill="F0F9FF"/>
+            <w:tcMar>
+              <w:top w:w="140" w:type="dxa"/>
+              <w:bottom w:w="140" w:type="dxa"/>
+              <w:left w:w="200" w:type="dxa"/>
+              <w:right w:w="200" w:type="dxa"/>
+            </w:tcMar>
+            <w:tcBorders>
+              <w:left w:val="single" w:sz="24" w:space="0" w:color="0284C7"/>
+              <w:top w:val="none"/>
+              <w:right w:val="none"/>
+              <w:bottom w:val="none"/>
+            </w:tcBorders>
+          </w:tcPr>
+          <w:p>
+            <w:pPr>
+              <w:spacing w:before="40" w:after="40"/>
+            </w:pPr>
+            <w:r>
+              <w:rPr>
+                <w:rFonts w:ascii="Calibri" w:hAnsi="Calibri"/>
+                <w:b/>
+                <w:color w:val="0284C7"/>
+                <w:sz w:val="21"/>
+              </w:rPr>
+              <w:t xml:space="preserve">📌 CIERRE COMERCIAL EN EL ACTO (90 SEGUNDOS): </w:t>
+            </w:r>
+            <w:r>
+              <w:rPr>
+                <w:rFonts w:ascii="Calibri" w:hAnsi="Calibri"/>
+                <w:color w:val="334155"/>
+                <w:sz w:val="20"/>
+              </w:rPr>
+              <w:t>Al presionar el botón '⚡ Aplicar al Proyecto Completo', el sistema vuelca inmediatamente la potencia pico (kWp), cantidad de paneles, azimut, inclinación, superficie de cubierta y el factor de atenuación por sombras 3D calculado a todas las demás pestañas, recalculando el flujo de caja en el acto. El botón '💬 WhatsApp' abre un mensaje con el resumen y pitch comercial redactado para enviar al cliente durante la reunión, y el botón '📸 Foto 3D' descarga una captura fotorrealista en alta resolución del gemelo digital.</w:t>
+            </w:r>
+          </w:p>
+        </w:tc>
+      </w:tr>
+    </w:tbl>
+    <w:p>
+      <w:pPr>
+        <w:spacing w:after="80"/>
+      </w:pPr>
+    </w:p>
+    <w:p>
+      <w:r>
+        <w:br w:type="page"/>
+      </w:r>
+    </w:p>
+    <w:p>
+      <w:pPr>
+        <w:pStyle w:val="Heading2"/>
+      </w:pPr>
+      <w:r>
+        <w:t>3.3. Pestaña ⚡ Energía, CO₂ y Desglose de Pérdidas Técnicas</w:t>
       </w:r>
     </w:p>
     <w:p>
@@ -2286,7 +2710,7 @@
         <w:pStyle w:val="Heading2"/>
       </w:pPr>
       <w:r>
-        <w:t>3.3. Pestaña 📈 Resultados Económicos (Compra Directa)</w:t>
+        <w:t>3.4. Pestaña 📈 Resultados Económicos (Compra Directa)</w:t>
       </w:r>
     </w:p>
     <w:p>
@@ -2765,7 +3189,7 @@
         <w:pStyle w:val="Heading2"/>
       </w:pPr>
       <w:r>
-        <w:t>3.4. Pestaña 🏦 Leasing vs. Compra al Contado</w:t>
+        <w:t>3.5. Pestaña 🏦 Leasing vs. Compra al Contado</w:t>
       </w:r>
     </w:p>
     <w:p>
@@ -2838,7 +3262,7 @@
         <w:pStyle w:val="Heading2"/>
       </w:pPr>
       <w:r>
-        <w:t>3.5. Pestaña 🎯 Análisis de Sensibilidad y Matrices de Riesgo</w:t>
+        <w:t>3.6. Pestaña 🎯 Análisis de Sensibilidad y Matrices de Riesgo</w:t>
       </w:r>
     </w:p>
     <w:p>
@@ -2858,7 +3282,7 @@
         <w:pStyle w:val="Heading2"/>
       </w:pPr>
       <w:r>
-        <w:t>3.6. Pestaña ⚖️ Comparador Multi-Proyecto Lado a Lado</w:t>
+        <w:t>3.7. Pestaña ⚖️ Comparador Multi-Proyecto Lado a Lado</w:t>
       </w:r>
     </w:p>
     <w:p>
@@ -2871,7 +3295,7 @@
         <w:pStyle w:val="Heading2"/>
       </w:pPr>
       <w:r>
-        <w:t>3.7. Pestaña 📄 Propuesta Comercial Ejecutiva (PDF Imprimible)</w:t>
+        <w:t>3.8. Pestaña 📄 Propuesta Comercial Ejecutiva (PDF Imprimible)</w:t>
       </w:r>
     </w:p>
     <w:p>

</xml_diff>

<commit_message>
feat: actualizar manual Word con modulo Techo 3D, agregar rotacion rapida 90deg de azimut y animacion visual al aplicar
</commit_message>
<xml_diff>
--- a/Manual_de_Usuario_Simulador_FV_ALP_GROUP.docx
+++ b/Manual_de_Usuario_Simulador_FV_ALP_GROUP.docx
@@ -2554,6 +2554,93 @@
         </w:tc>
       </w:tr>
     </w:tbl>
+    <w:p>
+      <w:pPr>
+        <w:pStyle w:val="Heading3"/>
+      </w:pPr>
+      <w:r>
+        <w:t>Guía Operativa Paso a Paso para el Asesor Comercial:</w:t>
+      </w:r>
+    </w:p>
+    <w:p>
+      <w:pPr>
+        <w:pStyle w:val="ListBullet"/>
+      </w:pPr>
+      <w:r>
+        <w:rPr>
+          <w:b/>
+          <w:color w:val="009FE3"/>
+        </w:rPr>
+        <w:t xml:space="preserve">1. Búsqueda y Localización Satelital: </w:t>
+      </w:r>
+      <w:r>
+        <w:t>Ingresá el parque industrial, ciudad o dirección en el buscador (ej: 'Parque Industrial Hudson, Berazategui') o presioná '📍 Mi GPS' para volar directamente a la planta.</w:t>
+      </w:r>
+    </w:p>
+    <w:p>
+      <w:pPr>
+        <w:pStyle w:val="ListBullet"/>
+      </w:pPr>
+      <w:r>
+        <w:rPr>
+          <w:b/>
+          <w:color w:val="009FE3"/>
+        </w:rPr>
+        <w:t xml:space="preserve">2. Delimitación de la Cubierta: </w:t>
+      </w:r>
+      <w:r>
+        <w:t>Podés optar por dos métodos instantáneos:</w:t>
+        <w:br/>
+        <w:t xml:space="preserve">  • Método A (Trazado Manual): Hacé clic en '✏️ Trazar Techo', marcá con un solo clic cada una de las 4 esquinas del galpón sobre la foto satelital, y finalizá presionando el botón verde '✅ Listo / Cerrar Techo' (o clic en el punto verde #1 / doble clic).</w:t>
+        <w:br/>
+        <w:t xml:space="preserve">  • Método B (Plantilla 90s): Centrá la fábrica en pantalla y presioná '🏭 Nave 1.200 m²', '🏢 Comercial 450 m²' o '🏬 Losa Plana 300 m²' para estampar la nave de inmediato.</w:t>
+      </w:r>
+    </w:p>
+    <w:p>
+      <w:pPr>
+        <w:pStyle w:val="ListBullet"/>
+      </w:pPr>
+      <w:r>
+        <w:rPr>
+          <w:b/>
+          <w:color w:val="009FE3"/>
+        </w:rPr>
+        <w:t xml:space="preserve">3. Optimización de Paneles y Orientación (Azimut): </w:t>
+      </w:r>
+      <w:r>
+        <w:t>En el panel lateral podés seleccionar la potencia del módulo (575 Wp Topcon, 600 Wp o 550 Wp), orientación Vertical u Horizontal y rotar el Azimut para que las filas sigan la cumbrera del techo. Al pulsar '⚡ Auto-Optimizar Disposición de Paneles', el sistema recalcula la retícula en milisegundos con capacidad para mega-naves logísticas de hasta 8.000 módulos (14.000+ m²).</w:t>
+      </w:r>
+    </w:p>
+    <w:p>
+      <w:pPr>
+        <w:pStyle w:val="ListBullet"/>
+      </w:pPr>
+      <w:r>
+        <w:rPr>
+          <w:b/>
+          <w:color w:val="009FE3"/>
+        </w:rPr>
+        <w:t xml:space="preserve">4. Detección de Obstáculos y Sombras 3D: </w:t>
+      </w:r>
+      <w:r>
+        <w:t>Presioná '🚫 Añadir Obstáculo' para marcar chimeneas, climatizadores HVAC, tragaluces o árboles linderos. El sistema excluirá los paneles en la zona de interferencia y el motor astronómico (Three.js) calculará la sombra solar arrojada a lo largo del año, deduciendo el porcentaje de pérdida anual (% derate).</w:t>
+      </w:r>
+    </w:p>
+    <w:p>
+      <w:pPr>
+        <w:pStyle w:val="ListBullet"/>
+      </w:pPr>
+      <w:r>
+        <w:rPr>
+          <w:b/>
+          <w:color w:val="009FE3"/>
+        </w:rPr>
+        <w:t xml:space="preserve">5. Transferencia al Proyecto y Cierre Comercial: </w:t>
+      </w:r>
+      <w:r>
+        <w:t>Revisá el resumen financiero express (ahorro mensual vs. cuota de leasing). Al presionar '⚡ Aplicar al Proyecto', la potencia (kWp), cantidad de paneles, azimut, inclinación y factor de sombras se transfieren en tiempo real a todas las pestañas de ingeniería y finanzas del simulador.</w:t>
+      </w:r>
+    </w:p>
     <w:tbl>
       <w:tblPr>
         <w:tblW w:type="auto" w:w="0"/>
@@ -2601,7 +2688,7 @@
                 <w:color w:val="334155"/>
                 <w:sz w:val="20"/>
               </w:rPr>
-              <w:t>Al presionar el botón '⚡ Aplicar al Proyecto Completo', el sistema vuelca inmediatamente la potencia pico (kWp), cantidad de paneles, azimut, inclinación, superficie de cubierta y el factor de atenuación por sombras 3D calculado a todas las demás pestañas, recalculando el flujo de caja en el acto. El botón '💬 WhatsApp' abre un mensaje con el resumen y pitch comercial redactado para enviar al cliente durante la reunión, y el botón '📸 Foto 3D' descarga una captura fotorrealista en alta resolución del gemelo digital.</w:t>
+              <w:t>Al presionar el botón '⚡ Aplicar al Proyecto', el sistema vuelca inmediatamente la potencia pico (kWp), cantidad de paneles, azimut, inclinación, superficie de cubierta y el factor de atenuación por sombras 3D calculado a todas las demás pestañas, recalculando el flujo de caja en el acto. El botón '💬 WhatsApp' abre un mensaje con el resumen y pitch comercial redactado para enviar al cliente durante la reunión, y el botón '📸 Foto 3D' descarga una captura fotorrealista en alta resolución del gemelo digital.</w:t>
             </w:r>
           </w:p>
         </w:tc>

</xml_diff>

<commit_message>
docs: actualizar manual Word con las 10 pestañas completas y todas las nuevas funciones de la plataforma
</commit_message>
<xml_diff>
--- a/Manual_de_Usuario_Simulador_FV_ALP_GROUP.docx
+++ b/Manual_de_Usuario_Simulador_FV_ALP_GROUP.docx
@@ -68,7 +68,7 @@
           <w:color w:val="475569"/>
           <w:sz w:val="28"/>
         </w:rPr>
-        <w:t>Simulador Fotovoltaico · Análisis Técnico-Económico, BESS, Matrices de Sensibilidad y Propuestas Comerciales</w:t>
+        <w:t>Simulador Fotovoltaico v2.0 · Diseño Satelital 3D, BESS, Monte Carlo &amp; Tornado, Pipeline Comercial, Tablero Gerencial y Propuestas Ejecutivas</w:t>
       </w:r>
     </w:p>
     <w:p>
@@ -538,7 +538,7 @@
                 <w:color w:val="334155"/>
                 <w:sz w:val="20"/>
               </w:rPr>
-              <w:t>3. Guía Paso a Paso de las Pestañas de Análisis</w:t>
+              <w:t>3. Guía Paso a Paso de las 10 Pestañas de la Plataforma</w:t>
             </w:r>
           </w:p>
         </w:tc>
@@ -595,7 +595,7 @@
                 <w:color w:val="334155"/>
                 <w:sz w:val="20"/>
               </w:rPr>
-              <w:t xml:space="preserve">   3.1. Pestaña 📋 Datos &amp; Asistente de Dimensionamiento</w:t>
+              <w:t xml:space="preserve">   3.1. Pestaña 📋 Datos, BOM Detallado y Chequeos Inteligentes</w:t>
             </w:r>
           </w:p>
         </w:tc>
@@ -652,7 +652,7 @@
                 <w:color w:val="334155"/>
                 <w:sz w:val="20"/>
               </w:rPr>
-              <w:t xml:space="preserve">   3.2. Pestaña 🛰️ Techo &amp; 3D (Diseño Satelital y Cierre Express en 90s)</w:t>
+              <w:t xml:space="preserve">   3.2. Pestaña 🛰️ Techo &amp; 3D (Diseño Satelital, Gemelo Digital y Cierre Express en 90s)</w:t>
             </w:r>
           </w:p>
         </w:tc>
@@ -709,7 +709,7 @@
                 <w:color w:val="334155"/>
                 <w:sz w:val="20"/>
               </w:rPr>
-              <w:t xml:space="preserve">   3.3. Pestaña ⚡ Energía, CO₂ y Desglose de Pérdidas Técnicas</w:t>
+              <w:t xml:space="preserve">   3.3. Pestaña ⚡ Energía, Curva 24h, BESS y Pérdidas Técnicas (Sankey)</w:t>
             </w:r>
           </w:p>
         </w:tc>
@@ -766,7 +766,7 @@
                 <w:color w:val="334155"/>
                 <w:sz w:val="20"/>
               </w:rPr>
-              <w:t xml:space="preserve">   3.4. Pestaña 📈 Resultados Económicos (Compra Directa)</w:t>
+              <w:t xml:space="preserve">   3.4. Pestaña 📈 Resultados Económicos (Compra Directa y Flujo de Fondos)</w:t>
             </w:r>
           </w:p>
         </w:tc>
@@ -823,7 +823,7 @@
                 <w:color w:val="334155"/>
                 <w:sz w:val="20"/>
               </w:rPr>
-              <w:t xml:space="preserve">   3.5. Pestaña 🏦 Leasing vs. Compra al Contado</w:t>
+              <w:t xml:space="preserve">   3.5. Pestaña 🏦 Financiamiento: Leasing ALP, Préstamos Bancarios y PPA</w:t>
             </w:r>
           </w:p>
         </w:tc>
@@ -880,7 +880,7 @@
                 <w:color w:val="334155"/>
                 <w:sz w:val="20"/>
               </w:rPr>
-              <w:t xml:space="preserve">   3.6. Pestaña 🎯 Análisis de Sensibilidad y Matrices de Riesgo</w:t>
+              <w:t xml:space="preserve">   3.6. Pestaña 🎯 Riesgo: Simulación Monte Carlo, Gráfico de Tornado y Matrices</w:t>
             </w:r>
           </w:p>
         </w:tc>
@@ -994,7 +994,7 @@
                 <w:color w:val="334155"/>
                 <w:sz w:val="20"/>
               </w:rPr>
-              <w:t xml:space="preserve">   3.8. Pestaña 📄 Propuesta Comercial Ejecutiva (Cotización para Clientes)</w:t>
+              <w:t xml:space="preserve">   3.8. Pestaña 📌 Pipeline Comercial, Revisiones Congeladas y Papelera</w:t>
             </w:r>
           </w:p>
         </w:tc>
@@ -1022,7 +1022,121 @@
                 <w:color w:val="334155"/>
                 <w:sz w:val="20"/>
               </w:rPr>
-              <w:t>12</w:t>
+              <w:t>13</w:t>
+            </w:r>
+          </w:p>
+        </w:tc>
+      </w:tr>
+      <w:tr>
+        <w:tc>
+          <w:tcPr>
+            <w:tcW w:type="dxa" w:w="8352"/>
+            <w:shd w:fill="FFFFFF"/>
+            <w:tcMar>
+              <w:top w:w="80" w:type="dxa"/>
+              <w:bottom w:w="80" w:type="dxa"/>
+              <w:left w:w="120" w:type="dxa"/>
+              <w:right w:w="120" w:type="dxa"/>
+            </w:tcMar>
+            <w:vAlign w:val="center"/>
+          </w:tcPr>
+          <w:p>
+            <w:pPr>
+              <w:spacing w:before="40" w:after="40"/>
+            </w:pPr>
+            <w:r>
+              <w:rPr>
+                <w:rFonts w:ascii="Calibri" w:hAnsi="Calibri"/>
+                <w:b w:val="0"/>
+                <w:color w:val="334155"/>
+                <w:sz w:val="20"/>
+              </w:rPr>
+              <w:t xml:space="preserve">   3.9. Pestaña 📊 Tablero Gerencial, Embudo de Ventas y Alertas de Seguimiento</w:t>
+            </w:r>
+          </w:p>
+        </w:tc>
+        <w:tc>
+          <w:tcPr>
+            <w:tcW w:type="dxa" w:w="1008"/>
+            <w:shd w:fill="FFFFFF"/>
+            <w:tcMar>
+              <w:top w:w="80" w:type="dxa"/>
+              <w:bottom w:w="80" w:type="dxa"/>
+              <w:left w:w="120" w:type="dxa"/>
+              <w:right w:w="120" w:type="dxa"/>
+            </w:tcMar>
+            <w:vAlign w:val="center"/>
+          </w:tcPr>
+          <w:p>
+            <w:pPr>
+              <w:spacing w:before="40" w:after="40"/>
+              <w:jc w:val="right"/>
+            </w:pPr>
+            <w:r>
+              <w:rPr>
+                <w:rFonts w:ascii="Calibri" w:hAnsi="Calibri"/>
+                <w:b w:val="0"/>
+                <w:color w:val="334155"/>
+                <w:sz w:val="20"/>
+              </w:rPr>
+              <w:t>14</w:t>
+            </w:r>
+          </w:p>
+        </w:tc>
+      </w:tr>
+      <w:tr>
+        <w:tc>
+          <w:tcPr>
+            <w:tcW w:type="dxa" w:w="8352"/>
+            <w:shd w:fill="FFFFFF"/>
+            <w:tcMar>
+              <w:top w:w="80" w:type="dxa"/>
+              <w:bottom w:w="80" w:type="dxa"/>
+              <w:left w:w="120" w:type="dxa"/>
+              <w:right w:w="120" w:type="dxa"/>
+            </w:tcMar>
+            <w:vAlign w:val="center"/>
+          </w:tcPr>
+          <w:p>
+            <w:pPr>
+              <w:spacing w:before="40" w:after="40"/>
+            </w:pPr>
+            <w:r>
+              <w:rPr>
+                <w:rFonts w:ascii="Calibri" w:hAnsi="Calibri"/>
+                <w:b w:val="0"/>
+                <w:color w:val="334155"/>
+                <w:sz w:val="20"/>
+              </w:rPr>
+              <w:t xml:space="preserve">   3.10. Pestaña 📄 Propuesta Comercial Ejecutiva (PDF / HTML / WhatsApp / Email)</w:t>
+            </w:r>
+          </w:p>
+        </w:tc>
+        <w:tc>
+          <w:tcPr>
+            <w:tcW w:type="dxa" w:w="1008"/>
+            <w:shd w:fill="FFFFFF"/>
+            <w:tcMar>
+              <w:top w:w="80" w:type="dxa"/>
+              <w:bottom w:w="80" w:type="dxa"/>
+              <w:left w:w="120" w:type="dxa"/>
+              <w:right w:w="120" w:type="dxa"/>
+            </w:tcMar>
+            <w:vAlign w:val="center"/>
+          </w:tcPr>
+          <w:p>
+            <w:pPr>
+              <w:spacing w:before="40" w:after="40"/>
+              <w:jc w:val="right"/>
+            </w:pPr>
+            <w:r>
+              <w:rPr>
+                <w:rFonts w:ascii="Calibri" w:hAnsi="Calibri"/>
+                <w:b w:val="0"/>
+                <w:color w:val="334155"/>
+                <w:sz w:val="20"/>
+              </w:rPr>
+              <w:t>15</w:t>
             </w:r>
           </w:p>
         </w:tc>
@@ -1079,7 +1193,7 @@
                 <w:color w:val="334155"/>
                 <w:sz w:val="20"/>
               </w:rPr>
-              <w:t>13</w:t>
+              <w:t>16</w:t>
             </w:r>
           </w:p>
         </w:tc>
@@ -1136,7 +1250,7 @@
                 <w:color w:val="334155"/>
                 <w:sz w:val="20"/>
               </w:rPr>
-              <w:t>14</w:t>
+              <w:t>17</w:t>
             </w:r>
           </w:p>
         </w:tc>
@@ -1193,7 +1307,7 @@
                 <w:color w:val="334155"/>
                 <w:sz w:val="20"/>
               </w:rPr>
-              <w:t>16</w:t>
+              <w:t>20</w:t>
             </w:r>
           </w:p>
         </w:tc>
@@ -1295,10 +1409,25 @@
           <w:b/>
           <w:color w:val="009FE3"/>
         </w:rPr>
-        <w:t xml:space="preserve">Dimensionamiento Inteligente de Cubierta: </w:t>
+        <w:t xml:space="preserve">Diseño Satelital 3D y Cierre Express en 90s: </w:t>
       </w:r>
       <w:r>
-        <w:t>Calcula la potencia pico instalable y módulos a partir de los metros cuadrados (m²) de techo disponibles o por objetivo de cobertura de factura.</w:t>
+        <w:t>Trazado de cubiertas sobre mosaico Esri/OSM, auto-layout de hasta 8.000 módulos, gemelo digital 3D WebGL con cálculo de sombras por Ray-Casting astronómico y botón 'Aplicar al Proyecto'.</w:t>
+      </w:r>
+    </w:p>
+    <w:p>
+      <w:pPr>
+        <w:pStyle w:val="ListBullet"/>
+      </w:pPr>
+      <w:r>
+        <w:rPr>
+          <w:b/>
+          <w:color w:val="009FE3"/>
+        </w:rPr>
+        <w:t xml:space="preserve">Dimensionamiento Inteligente y BOM Detallado: </w:t>
+      </w:r>
+      <w:r>
+        <w:t>Asistente por superficie (m²) o consumo (kWh), desglose de presupuesto por ítems (Bill of Materials) y sistema de chequeos inteligentes con semáforo de validación en tiempo real.</w:t>
       </w:r>
     </w:p>
     <w:p>
@@ -1313,7 +1442,7 @@
         <w:t xml:space="preserve">Balance Energético Mensual y Curva Diaria: </w:t>
       </w:r>
       <w:r>
-        <w:t>Simula la curva solar campana de 24 horas frente al perfil de consumo del cliente, integrando almacenamiento con baterías (BESS).</w:t>
+        <w:t>Simula la curva solar horaria de 24 horas frente al perfil de demanda del cliente, modelando almacenamiento con baterías BESS, desglose de pérdidas físicas (Sankey) y PR real.</w:t>
       </w:r>
     </w:p>
     <w:p>
@@ -1325,10 +1454,10 @@
           <w:b/>
           <w:color w:val="009FE3"/>
         </w:rPr>
-        <w:t xml:space="preserve">Desglose de Pérdidas y PR: </w:t>
+        <w:t xml:space="preserve">Evaluación Financiera Multimoneda Integral: </w:t>
       </w:r>
       <w:r>
-        <w:t>Modela factores térmicos, suciedad (soiling), tolerancia (mismatch), cableado DC/AC y rendimiento del inversor.</w:t>
+        <w:t>Cálculo instantáneo de VAN (ARS/USD), TIR, Payback simple y descontado, LCOE y ahorro acumulado a 20-30 años con conmutador ARS/USD y exportación de flujo a Excel (CSV).</w:t>
       </w:r>
     </w:p>
     <w:p>
@@ -1340,10 +1469,10 @@
           <w:b/>
           <w:color w:val="009FE3"/>
         </w:rPr>
-        <w:t xml:space="preserve">Evaluación Financiera Integral: </w:t>
+        <w:t xml:space="preserve">Comparador de Financiamiento 4 Vías: </w:t>
       </w:r>
       <w:r>
-        <w:t>Cálculo en tiempo real de VAN (ARS/USD), TIR, Payback simple, Payback descontado, LCOE y ahorro acumulado a 20-30 años.</w:t>
+        <w:t>Evaluación comparativa de Compra Contado, Leasing ALP no bancario (con escudo fiscal en Ganancias del 30-35%), Préstamos Bancarios (Francés/Alemán/UVA con CFT) y esquemas PPA.</w:t>
       </w:r>
     </w:p>
     <w:p>
@@ -1355,10 +1484,10 @@
           <w:b/>
           <w:color w:val="009FE3"/>
         </w:rPr>
-        <w:t xml:space="preserve">Modelo Completo de Leasing vs. Contado: </w:t>
+        <w:t xml:space="preserve">Análisis de Riesgo Estocástico &amp; Sensibilidad: </w:t>
       </w:r>
       <w:r>
-        <w:t>Incorpora canon periódico, seguro, mantenimiento, opción de compra y deducción en el Impuesto a las Ganancias.</w:t>
+        <w:t>Simulación de Monte Carlo (400 a 4.000 escenarios) con histograma de probabilidad de VAN positivo, diagrama de Tornado ('Qué variable mueve más el resultado') y matrices cruzadas de calor.</w:t>
       </w:r>
     </w:p>
     <w:p>
@@ -1370,10 +1499,10 @@
           <w:b/>
           <w:color w:val="009FE3"/>
         </w:rPr>
-        <w:t xml:space="preserve">Matrices de Riesgo y Sensibilidad: </w:t>
+        <w:t xml:space="preserve">Comparador Multi-Proyecto Lado a Lado: </w:t>
       </w:r>
       <w:r>
-        <w:t>Mapas de calor cruzados ante variaciones de tarifa eléctrica, CAPEX, inflación tarifaria y tasa de descuento.</w:t>
+        <w:t>Contraste sinóptico de múltiples variantes de potencia o clientes simultáneos.</w:t>
       </w:r>
     </w:p>
     <w:p>
@@ -1385,10 +1514,40 @@
           <w:b/>
           <w:color w:val="009FE3"/>
         </w:rPr>
-        <w:t xml:space="preserve">Propuesta Comercial Ejecutiva con Gráficos Vectoriales: </w:t>
+        <w:t xml:space="preserve">Pipeline Comercial &amp; Revisiones Congeladas: </w:t>
       </w:r>
       <w:r>
-        <w:t>Generación de cotizaciones formales listas para imprimir o exportar a PDF con membrete de ALP GROUP y gráficos SVG.</w:t>
+        <w:t>Gestión de ventas estilo Kanban (Borrador a Ganada) con ponderación probabilística, congelamiento inmutable de revisiones históricas y papelera de reciclaje.</w:t>
+      </w:r>
+    </w:p>
+    <w:p>
+      <w:pPr>
+        <w:pStyle w:val="ListBullet"/>
+      </w:pPr>
+      <w:r>
+        <w:rPr>
+          <w:b/>
+          <w:color w:val="009FE3"/>
+        </w:rPr>
+        <w:t xml:space="preserve">Tablero Gerencial &amp; Business Intelligence: </w:t>
+      </w:r>
+      <w:r>
+        <w:t>Métricas consolidadas de cartera en MWp y U$D, embudo de conversión, desglose por provincia y vendedor, y alertas automáticas de cotizaciones estancadas.</w:t>
+      </w:r>
+    </w:p>
+    <w:p>
+      <w:pPr>
+        <w:pStyle w:val="ListBullet"/>
+      </w:pPr>
+      <w:r>
+        <w:rPr>
+          <w:b/>
+          <w:color w:val="009FE3"/>
+        </w:rPr>
+        <w:t xml:space="preserve">Propuesta Comercial Multicanal Ejecutiva: </w:t>
+      </w:r>
+      <w:r>
+        <w:t>Generación de cotizaciones formales con membrete y logo corporativo, ficha satelital 3D, gráficos vectoriales SVG, y exportación a PDF, HTML autónomo, WhatsApp y Email.</w:t>
       </w:r>
     </w:p>
     <w:p>
@@ -1681,7 +1840,7 @@
         <w:rPr>
           <w:color w:val="009FE3"/>
         </w:rPr>
-        <w:t>3. Guía Paso a Paso de las 7 Pestañas de Análisis</w:t>
+        <w:t>3. Guía Paso a Paso de las 10 Pestañas de la Plataforma</w:t>
       </w:r>
     </w:p>
     <w:p>
@@ -1689,12 +1848,12 @@
         <w:pStyle w:val="Heading2"/>
       </w:pPr>
       <w:r>
-        <w:t>3.1. Pestaña 📋 Datos &amp; Asistente de Dimensionamiento</w:t>
+        <w:t>3.1. Pestaña 📋 Datos, BOM Detallado y Chequeos Inteligentes</w:t>
       </w:r>
     </w:p>
     <w:p>
       <w:r>
-        <w:t>Es el punto de entrada para parametrizar el proyecto. Contiene formularios declarativos y herramientas de cálculo avanzadas:</w:t>
+        <w:t>Es el centro neurálgico de ingeniería y parametrización de la plataforma. Integra formularios declarativos, asistentes geométricos, desglose de costos ítem por ítem (BOM) y un auditor de reglas técnicas en tiempo real:</w:t>
       </w:r>
     </w:p>
     <w:p>
@@ -2167,7 +2326,7 @@
         <w:t xml:space="preserve">Cliente y Emplazamiento: </w:t>
       </w:r>
       <w:r>
-        <w:t>Razón social, CUIT, ubicación y selector de ciudad argentina para autocompletar la radiación solar anual.</w:t>
+        <w:t>Razón social, CUIT (con validación de dígito verificador Módulo 11), ubicación y selector de ciudad argentina para autocompletar la radiación solar anual y coordenadas satelitales.</w:t>
       </w:r>
     </w:p>
     <w:p>
@@ -2182,7 +2341,7 @@
         <w:t xml:space="preserve">Generación Fotovoltaica: </w:t>
       </w:r>
       <w:r>
-        <w:t>Potencia kWp, costo unitario (U$D/kWp), tipo de cambio ($/USD), Performance Ratio (PR %), irradiación anual y degradación de paneles (%/año).</w:t>
+        <w:t>Potencia kWp, costo unitario (U$D/kWp), tipo de cambio ($/USD), Performance Ratio (PR %), irradiación anual en plano y degradación anual de paneles (%/año).</w:t>
       </w:r>
     </w:p>
     <w:p>
@@ -2197,7 +2356,7 @@
         <w:t xml:space="preserve">Almacenamiento con Baterías (BESS): </w:t>
       </w:r>
       <w:r>
-        <w:t>Habilitación de banco de acumulación, tecnología (Litio LFP / Gel), capacidad en kWh, costo unitario (U$D/kWh) y profundidad de descarga (DoD %). El sistema calcula automáticamente la autonomía de respaldo en horas.</w:t>
+        <w:t>Habilitación de banco de acumulación, tecnología (Litio LFP / Gel Plomo-Ácido), capacidad en kWh, costo unitario (U$D/kWh) y profundidad de descarga máxima (DoD %). El sistema modela el ciclado diario y la autonomía en horas ante cortes de red.</w:t>
       </w:r>
     </w:p>
     <w:p>
@@ -2212,7 +2371,7 @@
         <w:t xml:space="preserve">Tarifa Eléctrica e Impuestos: </w:t>
       </w:r>
       <w:r>
-        <w:t>Tarifa monómica de energía ($/kWh) y tabla de impuestos provinciales/municipales con presets automáticos para EPE Santa Fe, Edenor/Edesur, EDEN, EPEC Córdoba, etc. Modalidad de inyección remunerada de excedentes.</w:t>
+        <w:t>Tarifa monómica de energía ($/kWh) o desglose por bandas horarias (Pico, Resto, Valle), potencia contratada e impuestos provinciales/municipales con presets oficiales para EPE Santa Fe, Edenor/Edesur, EDEN, EPEC Córdoba, etc. Modalidad de inyección remunerada según Ley 27.424.</w:t>
       </w:r>
     </w:p>
     <w:p>
@@ -2227,7 +2386,7 @@
         <w:t xml:space="preserve">Parámetros Macroeconómicos: </w:t>
       </w:r>
       <w:r>
-        <w:t>Horizonte de vida útil (20 a 30 años), tasa de descuento exigida (WACC %), aumento anual de tarifa (inflación energética %), OPEX anual (% CAPEX) y recambio programado de inversores.</w:t>
+        <w:t>Horizonte de evaluación (20 a 30 años), tasa de descuento exigida (WACC %), ajuste anual de tarifas eléctricas (inflación energética %), OPEX anual (% CAPEX) y ciclos de recambio de inversores y baterías.</w:t>
       </w:r>
     </w:p>
     <w:p>
@@ -2239,10 +2398,191 @@
           <w:b/>
           <w:color w:val="009FE3"/>
         </w:rPr>
-        <w:t xml:space="preserve">Financiamiento por Leasing: </w:t>
+        <w:t xml:space="preserve">Condiciones Financieras: </w:t>
       </w:r>
       <w:r>
-        <w:t>Canon mensual por kWp, plazo en meses (12 a 120), pago inicial de anticipo, valor residual / opción de compra, seguro anual, mantenimiento anual y alícuota deducible del Impuesto a las Ganancias (30% o 35%).</w:t>
+        <w:t>Parámetros para Leasing (canon por kWp, plazo en meses, anticipo, opción residual, seguro y deducción en Ganancias), Préstamos bancarios (Francés/Alemán/UVA y CFT) y contratos PPA.</w:t>
+      </w:r>
+    </w:p>
+    <w:p>
+      <w:pPr>
+        <w:pStyle w:val="Heading3"/>
+      </w:pPr>
+      <w:r>
+        <w:t>C. Presupuesto Detallado por Ítems (BOM - Bill of Materials):</w:t>
+      </w:r>
+    </w:p>
+    <w:p>
+      <w:r>
+        <w:t>Al tildar 'Presupuesto detallado por ítems', el sistema desactiva el costo global fijo y habilita una planilla analítica de cómputo y presupuesto de obra donde cada componente se cotiza por unidad o por kWp instalado:</w:t>
+      </w:r>
+    </w:p>
+    <w:p>
+      <w:pPr>
+        <w:pStyle w:val="ListBullet"/>
+      </w:pPr>
+      <w:r>
+        <w:rPr>
+          <w:b/>
+          <w:color w:val="009FE3"/>
+        </w:rPr>
+        <w:t xml:space="preserve">Módulos Fotovoltaicos: </w:t>
+      </w:r>
+      <w:r>
+        <w:t>Cómputo automático según cantidad de paneles y potencia unitaria (U$D/panel o U$D/Wp).</w:t>
+      </w:r>
+    </w:p>
+    <w:p>
+      <w:pPr>
+        <w:pStyle w:val="ListBullet"/>
+      </w:pPr>
+      <w:r>
+        <w:rPr>
+          <w:b/>
+          <w:color w:val="009FE3"/>
+        </w:rPr>
+        <w:t xml:space="preserve">Inversores On-Grid / Híbridos: </w:t>
+      </w:r>
+      <w:r>
+        <w:t>Unidades de inversores centrales o microinversores, dimensionados para la potencia pico de campo.</w:t>
+      </w:r>
+    </w:p>
+    <w:p>
+      <w:pPr>
+        <w:pStyle w:val="ListBullet"/>
+      </w:pPr>
+      <w:r>
+        <w:rPr>
+          <w:b/>
+          <w:color w:val="009FE3"/>
+        </w:rPr>
+        <w:t xml:space="preserve">Estructuras de Montaje: </w:t>
+      </w:r>
+      <w:r>
+        <w:t>Rieles de aluminio extruido, grampas intermedias/finales, triángulos fijos o anclajes a chapa grecada.</w:t>
+      </w:r>
+    </w:p>
+    <w:p>
+      <w:pPr>
+        <w:pStyle w:val="ListBullet"/>
+      </w:pPr>
+      <w:r>
+        <w:rPr>
+          <w:b/>
+          <w:color w:val="009FE3"/>
+        </w:rPr>
+        <w:t xml:space="preserve">Protecciones Eléctricas DC/AC: </w:t>
+      </w:r>
+      <w:r>
+        <w:t>Tableros seccionadores, fusibles gPV, descargadores de sobretensión transitoria (SPD Tipo II), termomagnéticas y disyuntores diferenciales.</w:t>
+      </w:r>
+    </w:p>
+    <w:p>
+      <w:pPr>
+        <w:pStyle w:val="ListBullet"/>
+      </w:pPr>
+      <w:r>
+        <w:rPr>
+          <w:b/>
+          <w:color w:val="009FE3"/>
+        </w:rPr>
+        <w:t xml:space="preserve">Cableado Solar y Conectores: </w:t>
+      </w:r>
+      <w:r>
+        <w:t>Cables unipolares solares de 4/6 mm² con aislación reticulada resistente a UV, conectores MC4 y canalizaciones.</w:t>
+      </w:r>
+    </w:p>
+    <w:p>
+      <w:pPr>
+        <w:pStyle w:val="ListBullet"/>
+      </w:pPr>
+      <w:r>
+        <w:rPr>
+          <w:b/>
+          <w:color w:val="009FE3"/>
+        </w:rPr>
+        <w:t xml:space="preserve">Mano de Obra e Ingeniería: </w:t>
+      </w:r>
+      <w:r>
+        <w:t>Instalación electromecánica, izajes, puesta en marcha, ensayos y tramitación del certificado de Usuario-Generador ante la distribuidora.</w:t>
+      </w:r>
+    </w:p>
+    <w:p>
+      <w:pPr>
+        <w:pStyle w:val="ListBullet"/>
+      </w:pPr>
+      <w:r>
+        <w:rPr>
+          <w:b/>
+          <w:color w:val="009FE3"/>
+        </w:rPr>
+        <w:t xml:space="preserve">Almacenamiento BESS (opcional): </w:t>
+      </w:r>
+      <w:r>
+        <w:t>Módulos de baterías de litio ferrofosfato (LiFePO4) o gel con rack y BMS.</w:t>
+      </w:r>
+    </w:p>
+    <w:p>
+      <w:r>
+        <w:t>El presupuesto suma automáticamente los subtotales, calcula el CAPEX final del proyecto y actualiza el ratio U$D/kWp resultante.</w:t>
+      </w:r>
+    </w:p>
+    <w:p>
+      <w:pPr>
+        <w:pStyle w:val="Heading3"/>
+      </w:pPr>
+      <w:r>
+        <w:t>D. Panel de Chequeos Inteligentes (Semáforo de Validación):</w:t>
+      </w:r>
+    </w:p>
+    <w:p>
+      <w:r>
+        <w:t>Ubicado en la parte superior de la pestaña Datos, el panel de Chequeos Inteligentes evalúa de forma continua más de 12 reglas de consistencia técnica y normativa, alertando antes de presentar la cotización:</w:t>
+      </w:r>
+    </w:p>
+    <w:p>
+      <w:pPr>
+        <w:pStyle w:val="ListBullet"/>
+      </w:pPr>
+      <w:r>
+        <w:rPr>
+          <w:b/>
+          <w:color w:val="009FE3"/>
+        </w:rPr>
+        <w:t xml:space="preserve">🟢 Proyecto Coherente: </w:t>
+      </w:r>
+      <w:r>
+        <w:t>Todos los parámetros de potencia, módulos, relaciones DC/AC y marco fiscal se encuentran dentro de los estándares óptimos de ingeniería.</w:t>
+      </w:r>
+    </w:p>
+    <w:p>
+      <w:pPr>
+        <w:pStyle w:val="ListBullet"/>
+      </w:pPr>
+      <w:r>
+        <w:rPr>
+          <w:b/>
+          <w:color w:val="009FE3"/>
+        </w:rPr>
+        <w:t xml:space="preserve">🟡 Advertencias Técnicas: </w:t>
+      </w:r>
+      <w:r>
+        <w:t>Avisa situaciones no críticas pero que requieren atención: ej. sobredimensionamiento DC/AC &gt; 1.30 (posible recorte de potencia en horas pico), inyección sin precio asignado o sobrecarga cercana al límite de la cubierta.</w:t>
+      </w:r>
+    </w:p>
+    <w:p>
+      <w:pPr>
+        <w:pStyle w:val="ListBullet"/>
+      </w:pPr>
+      <w:r>
+        <w:rPr>
+          <w:b/>
+          <w:color w:val="009FE3"/>
+        </w:rPr>
+        <w:t xml:space="preserve">🔴 Inconsistencias Críticas: </w:t>
+      </w:r>
+      <w:r>
+        <w:t>Detecta errores graves: ej. potencia contratada insuficiente para la inyección proyectada, CUIT inválido, o parámetros económicos negativos.</w:t>
       </w:r>
     </w:p>
     <w:p>
@@ -3276,12 +3616,452 @@
         <w:pStyle w:val="Heading2"/>
       </w:pPr>
       <w:r>
-        <w:t>3.5. Pestaña 🏦 Leasing vs. Compra al Contado</w:t>
+        <w:t>3.5. Pestaña 🏦 Financiamiento: Comparador 4 Vías (Contado, Leasing ALP, Préstamos y PPA)</w:t>
       </w:r>
     </w:p>
     <w:p>
       <w:r>
-        <w:t>Permite presentar una alternativa de financiamiento donde el cliente no inmoviliza capital inicial elevado:</w:t>
+        <w:t>Permite contrastar de manera simultánea cuatro modalidades de financiamiento e inversión para proyectos solares corporativos, todas expresadas en dólares constantes con ahorros proyectados y descontadas a la tasa WACC:</w:t>
+      </w:r>
+    </w:p>
+    <w:tbl>
+      <w:tblPr>
+        <w:tblW w:type="auto" w:w="0"/>
+        <w:jc w:val="center"/>
+        <w:tblLook w:firstColumn="1" w:firstRow="1" w:lastColumn="0" w:lastRow="0" w:noHBand="0" w:noVBand="1" w:val="04A0"/>
+      </w:tblPr>
+      <w:tblGrid>
+        <w:gridCol w:w="2592"/>
+        <w:gridCol w:w="3888"/>
+        <w:gridCol w:w="3600"/>
+      </w:tblGrid>
+      <w:tr>
+        <w:tc>
+          <w:tcPr>
+            <w:tcW w:type="dxa" w:w="3120"/>
+            <w:shd w:fill="009FE3"/>
+            <w:tcMar>
+              <w:top w:w="80" w:type="dxa"/>
+              <w:bottom w:w="80" w:type="dxa"/>
+              <w:left w:w="120" w:type="dxa"/>
+              <w:right w:w="120" w:type="dxa"/>
+            </w:tcMar>
+            <w:vAlign w:val="center"/>
+          </w:tcPr>
+          <w:p>
+            <w:pPr>
+              <w:spacing w:before="40" w:after="40"/>
+            </w:pPr>
+            <w:r>
+              <w:rPr>
+                <w:rFonts w:ascii="Calibri" w:hAnsi="Calibri"/>
+                <w:b/>
+                <w:color w:val="FFFFFF"/>
+                <w:sz w:val="19"/>
+              </w:rPr>
+              <w:t>Modalidad</w:t>
+            </w:r>
+          </w:p>
+        </w:tc>
+        <w:tc>
+          <w:tcPr>
+            <w:tcW w:type="dxa" w:w="3120"/>
+            <w:shd w:fill="009FE3"/>
+            <w:tcMar>
+              <w:top w:w="80" w:type="dxa"/>
+              <w:bottom w:w="80" w:type="dxa"/>
+              <w:left w:w="120" w:type="dxa"/>
+              <w:right w:w="120" w:type="dxa"/>
+            </w:tcMar>
+            <w:vAlign w:val="center"/>
+          </w:tcPr>
+          <w:p>
+            <w:pPr>
+              <w:spacing w:before="40" w:after="40"/>
+            </w:pPr>
+            <w:r>
+              <w:rPr>
+                <w:rFonts w:ascii="Calibri" w:hAnsi="Calibri"/>
+                <w:b/>
+                <w:color w:val="FFFFFF"/>
+                <w:sz w:val="19"/>
+              </w:rPr>
+              <w:t>Esquema de Desembolso y Propiedad</w:t>
+            </w:r>
+          </w:p>
+        </w:tc>
+        <w:tc>
+          <w:tcPr>
+            <w:tcW w:type="dxa" w:w="3120"/>
+            <w:shd w:fill="009FE3"/>
+            <w:tcMar>
+              <w:top w:w="80" w:type="dxa"/>
+              <w:bottom w:w="80" w:type="dxa"/>
+              <w:left w:w="120" w:type="dxa"/>
+              <w:right w:w="120" w:type="dxa"/>
+            </w:tcMar>
+            <w:vAlign w:val="center"/>
+          </w:tcPr>
+          <w:p>
+            <w:pPr>
+              <w:spacing w:before="40" w:after="40"/>
+            </w:pPr>
+            <w:r>
+              <w:rPr>
+                <w:rFonts w:ascii="Calibri" w:hAnsi="Calibri"/>
+                <w:b/>
+                <w:color w:val="FFFFFF"/>
+                <w:sz w:val="19"/>
+              </w:rPr>
+              <w:t>Beneficio Clave y Ventaja Fiscal</w:t>
+            </w:r>
+          </w:p>
+        </w:tc>
+      </w:tr>
+      <w:tr>
+        <w:tc>
+          <w:tcPr>
+            <w:tcW w:type="dxa" w:w="3120"/>
+            <w:shd w:fill="F8FAFC"/>
+            <w:tcMar>
+              <w:top w:w="80" w:type="dxa"/>
+              <w:bottom w:w="80" w:type="dxa"/>
+              <w:left w:w="120" w:type="dxa"/>
+              <w:right w:w="120" w:type="dxa"/>
+            </w:tcMar>
+            <w:vAlign w:val="center"/>
+          </w:tcPr>
+          <w:p>
+            <w:pPr>
+              <w:spacing w:before="40" w:after="40"/>
+            </w:pPr>
+            <w:r>
+              <w:rPr>
+                <w:rFonts w:ascii="Calibri" w:hAnsi="Calibri"/>
+                <w:b/>
+                <w:color w:val="334155"/>
+                <w:sz w:val="18"/>
+              </w:rPr>
+              <w:t>1. Compra al Contado (Llave en mano)</w:t>
+            </w:r>
+          </w:p>
+        </w:tc>
+        <w:tc>
+          <w:tcPr>
+            <w:tcW w:type="dxa" w:w="3120"/>
+            <w:shd w:fill="F8FAFC"/>
+            <w:tcMar>
+              <w:top w:w="80" w:type="dxa"/>
+              <w:bottom w:w="80" w:type="dxa"/>
+              <w:left w:w="120" w:type="dxa"/>
+              <w:right w:w="120" w:type="dxa"/>
+            </w:tcMar>
+            <w:vAlign w:val="center"/>
+          </w:tcPr>
+          <w:p>
+            <w:pPr>
+              <w:spacing w:before="40" w:after="40"/>
+            </w:pPr>
+            <w:r>
+              <w:rPr>
+                <w:rFonts w:ascii="Calibri" w:hAnsi="Calibri"/>
+                <w:b w:val="0"/>
+                <w:color w:val="334155"/>
+                <w:sz w:val="18"/>
+              </w:rPr>
+              <w:t>100% de desembolso inicial (CAPEX). El cliente es dueño del activo desde el día 1.</w:t>
+            </w:r>
+          </w:p>
+        </w:tc>
+        <w:tc>
+          <w:tcPr>
+            <w:tcW w:type="dxa" w:w="3120"/>
+            <w:shd w:fill="F8FAFC"/>
+            <w:tcMar>
+              <w:top w:w="80" w:type="dxa"/>
+              <w:bottom w:w="80" w:type="dxa"/>
+              <w:left w:w="120" w:type="dxa"/>
+              <w:right w:w="120" w:type="dxa"/>
+            </w:tcMar>
+            <w:vAlign w:val="center"/>
+          </w:tcPr>
+          <w:p>
+            <w:pPr>
+              <w:spacing w:before="40" w:after="40"/>
+            </w:pPr>
+            <w:r>
+              <w:rPr>
+                <w:rFonts w:ascii="Calibri" w:hAnsi="Calibri"/>
+                <w:b w:val="0"/>
+                <w:color w:val="334155"/>
+                <w:sz w:val="18"/>
+              </w:rPr>
+              <w:t>Mayor ahorro monetario acumulado y máximo VAN a 25-30 años.</w:t>
+            </w:r>
+          </w:p>
+        </w:tc>
+      </w:tr>
+      <w:tr>
+        <w:tc>
+          <w:tcPr>
+            <w:tcW w:type="dxa" w:w="3120"/>
+            <w:shd w:fill="FFFFFF"/>
+            <w:tcMar>
+              <w:top w:w="80" w:type="dxa"/>
+              <w:bottom w:w="80" w:type="dxa"/>
+              <w:left w:w="120" w:type="dxa"/>
+              <w:right w:w="120" w:type="dxa"/>
+            </w:tcMar>
+            <w:vAlign w:val="center"/>
+          </w:tcPr>
+          <w:p>
+            <w:pPr>
+              <w:spacing w:before="40" w:after="40"/>
+            </w:pPr>
+            <w:r>
+              <w:rPr>
+                <w:rFonts w:ascii="Calibri" w:hAnsi="Calibri"/>
+                <w:b/>
+                <w:color w:val="334155"/>
+                <w:sz w:val="18"/>
+              </w:rPr>
+              <w:t>2. Leasing ALP (No bancario)</w:t>
+            </w:r>
+          </w:p>
+        </w:tc>
+        <w:tc>
+          <w:tcPr>
+            <w:tcW w:type="dxa" w:w="3120"/>
+            <w:shd w:fill="FFFFFF"/>
+            <w:tcMar>
+              <w:top w:w="80" w:type="dxa"/>
+              <w:bottom w:w="80" w:type="dxa"/>
+              <w:left w:w="120" w:type="dxa"/>
+              <w:right w:w="120" w:type="dxa"/>
+            </w:tcMar>
+            <w:vAlign w:val="center"/>
+          </w:tcPr>
+          <w:p>
+            <w:pPr>
+              <w:spacing w:before="40" w:after="40"/>
+            </w:pPr>
+            <w:r>
+              <w:rPr>
+                <w:rFonts w:ascii="Calibri" w:hAnsi="Calibri"/>
+                <w:b w:val="0"/>
+                <w:color w:val="334155"/>
+                <w:sz w:val="18"/>
+              </w:rPr>
+              <w:t>Desembolso inicial reducido (anticipo). Cuotas mensuales fijas por kWp con seguro y O&amp;M incluidos. Opción de compra final.</w:t>
+            </w:r>
+          </w:p>
+        </w:tc>
+        <w:tc>
+          <w:tcPr>
+            <w:tcW w:type="dxa" w:w="3120"/>
+            <w:shd w:fill="FFFFFF"/>
+            <w:tcMar>
+              <w:top w:w="80" w:type="dxa"/>
+              <w:bottom w:w="80" w:type="dxa"/>
+              <w:left w:w="120" w:type="dxa"/>
+              <w:right w:w="120" w:type="dxa"/>
+            </w:tcMar>
+            <w:vAlign w:val="center"/>
+          </w:tcPr>
+          <w:p>
+            <w:pPr>
+              <w:spacing w:before="40" w:after="40"/>
+            </w:pPr>
+            <w:r>
+              <w:rPr>
+                <w:rFonts w:ascii="Calibri" w:hAnsi="Calibri"/>
+                <w:b w:val="0"/>
+                <w:color w:val="334155"/>
+                <w:sz w:val="18"/>
+              </w:rPr>
+              <w:t>100% de la cuota deducible del Impuesto a las Ganancias (alícuota 30-35%). No compromete márgenes crediticios bancarios.</w:t>
+            </w:r>
+          </w:p>
+        </w:tc>
+      </w:tr>
+      <w:tr>
+        <w:tc>
+          <w:tcPr>
+            <w:tcW w:type="dxa" w:w="3120"/>
+            <w:shd w:fill="F8FAFC"/>
+            <w:tcMar>
+              <w:top w:w="80" w:type="dxa"/>
+              <w:bottom w:w="80" w:type="dxa"/>
+              <w:left w:w="120" w:type="dxa"/>
+              <w:right w:w="120" w:type="dxa"/>
+            </w:tcMar>
+            <w:vAlign w:val="center"/>
+          </w:tcPr>
+          <w:p>
+            <w:pPr>
+              <w:spacing w:before="40" w:after="40"/>
+            </w:pPr>
+            <w:r>
+              <w:rPr>
+                <w:rFonts w:ascii="Calibri" w:hAnsi="Calibri"/>
+                <w:b/>
+                <w:color w:val="334155"/>
+                <w:sz w:val="18"/>
+              </w:rPr>
+              <w:t>3. Préstamo Bancario Tradicional</w:t>
+            </w:r>
+          </w:p>
+        </w:tc>
+        <w:tc>
+          <w:tcPr>
+            <w:tcW w:type="dxa" w:w="3120"/>
+            <w:shd w:fill="F8FAFC"/>
+            <w:tcMar>
+              <w:top w:w="80" w:type="dxa"/>
+              <w:bottom w:w="80" w:type="dxa"/>
+              <w:left w:w="120" w:type="dxa"/>
+              <w:right w:w="120" w:type="dxa"/>
+            </w:tcMar>
+            <w:vAlign w:val="center"/>
+          </w:tcPr>
+          <w:p>
+            <w:pPr>
+              <w:spacing w:before="40" w:after="40"/>
+            </w:pPr>
+            <w:r>
+              <w:rPr>
+                <w:rFonts w:ascii="Calibri" w:hAnsi="Calibri"/>
+                <w:b w:val="0"/>
+                <w:color w:val="334155"/>
+                <w:sz w:val="18"/>
+              </w:rPr>
+              <w:t>Financiamiento del 70% al 100% del CAPEX. Sistemas Francés, Alemán o UVA en pesos/dólares con cálculo de CFT.</w:t>
+            </w:r>
+          </w:p>
+        </w:tc>
+        <w:tc>
+          <w:tcPr>
+            <w:tcW w:type="dxa" w:w="3120"/>
+            <w:shd w:fill="F8FAFC"/>
+            <w:tcMar>
+              <w:top w:w="80" w:type="dxa"/>
+              <w:bottom w:w="80" w:type="dxa"/>
+              <w:left w:w="120" w:type="dxa"/>
+              <w:right w:w="120" w:type="dxa"/>
+            </w:tcMar>
+            <w:vAlign w:val="center"/>
+          </w:tcPr>
+          <w:p>
+            <w:pPr>
+              <w:spacing w:before="40" w:after="40"/>
+            </w:pPr>
+            <w:r>
+              <w:rPr>
+                <w:rFonts w:ascii="Calibri" w:hAnsi="Calibri"/>
+                <w:b w:val="0"/>
+                <w:color w:val="334155"/>
+                <w:sz w:val="18"/>
+              </w:rPr>
+              <w:t>El cliente conserva capital de trabajo. Amortización del bien e intereses de deuda son deducibles impositivamente.</w:t>
+            </w:r>
+          </w:p>
+        </w:tc>
+      </w:tr>
+      <w:tr>
+        <w:tc>
+          <w:tcPr>
+            <w:tcW w:type="dxa" w:w="3120"/>
+            <w:shd w:fill="FFFFFF"/>
+            <w:tcMar>
+              <w:top w:w="80" w:type="dxa"/>
+              <w:bottom w:w="80" w:type="dxa"/>
+              <w:left w:w="120" w:type="dxa"/>
+              <w:right w:w="120" w:type="dxa"/>
+            </w:tcMar>
+            <w:vAlign w:val="center"/>
+          </w:tcPr>
+          <w:p>
+            <w:pPr>
+              <w:spacing w:before="40" w:after="40"/>
+            </w:pPr>
+            <w:r>
+              <w:rPr>
+                <w:rFonts w:ascii="Calibri" w:hAnsi="Calibri"/>
+                <w:b/>
+                <w:color w:val="334155"/>
+                <w:sz w:val="18"/>
+              </w:rPr>
+              <w:t>4. Contrato PPA (Power Purchase)</w:t>
+            </w:r>
+          </w:p>
+        </w:tc>
+        <w:tc>
+          <w:tcPr>
+            <w:tcW w:type="dxa" w:w="3120"/>
+            <w:shd w:fill="FFFFFF"/>
+            <w:tcMar>
+              <w:top w:w="80" w:type="dxa"/>
+              <w:bottom w:w="80" w:type="dxa"/>
+              <w:left w:w="120" w:type="dxa"/>
+              <w:right w:w="120" w:type="dxa"/>
+            </w:tcMar>
+            <w:vAlign w:val="center"/>
+          </w:tcPr>
+          <w:p>
+            <w:pPr>
+              <w:spacing w:before="40" w:after="40"/>
+            </w:pPr>
+            <w:r>
+              <w:rPr>
+                <w:rFonts w:ascii="Calibri" w:hAnsi="Calibri"/>
+                <w:b w:val="0"/>
+                <w:color w:val="334155"/>
+                <w:sz w:val="18"/>
+              </w:rPr>
+              <w:t>Desembolso inicial U$D 0. El cliente compra los kWh solares a una tarifa pactada inferior a la de red.</w:t>
+            </w:r>
+          </w:p>
+        </w:tc>
+        <w:tc>
+          <w:tcPr>
+            <w:tcW w:type="dxa" w:w="3120"/>
+            <w:shd w:fill="FFFFFF"/>
+            <w:tcMar>
+              <w:top w:w="80" w:type="dxa"/>
+              <w:bottom w:w="80" w:type="dxa"/>
+              <w:left w:w="120" w:type="dxa"/>
+              <w:right w:w="120" w:type="dxa"/>
+            </w:tcMar>
+            <w:vAlign w:val="center"/>
+          </w:tcPr>
+          <w:p>
+            <w:pPr>
+              <w:spacing w:before="40" w:after="40"/>
+            </w:pPr>
+            <w:r>
+              <w:rPr>
+                <w:rFonts w:ascii="Calibri" w:hAnsi="Calibri"/>
+                <w:b w:val="0"/>
+                <w:color w:val="334155"/>
+                <w:sz w:val="18"/>
+              </w:rPr>
+              <w:t>Ahorro operativo desde el primer mes sin asumir riesgos de operación ni deuda financiera.</w:t>
+            </w:r>
+          </w:p>
+        </w:tc>
+      </w:tr>
+    </w:tbl>
+    <w:p>
+      <w:pPr>
+        <w:spacing w:after="80"/>
+      </w:pPr>
+    </w:p>
+    <w:p>
+      <w:pPr>
+        <w:pStyle w:val="Heading3"/>
+      </w:pPr>
+      <w:r>
+        <w:t>Detalle Operativo del Leasing ALP:</w:t>
       </w:r>
     </w:p>
     <w:p>
@@ -3296,7 +4076,7 @@
         <w:t xml:space="preserve">Flujo Neto Mensual: </w:t>
       </w:r>
       <w:r>
-        <w:t>Compara el ahorro eléctrico mensual generado por los paneles frente a la cuota integral de leasing (canon + seguro + mantenimiento). Si el ahorro mensual supera la cuota, el proyecto se autofinancia desde el mes 1.</w:t>
+        <w:t>Compara mes a mes el ahorro en factura eléctrica vs. la cuota integral del leasing (canon + seguro + mantenimiento). Si el ahorro supera la cuota, el proyecto tiene flujo de caja positivo inmediato.</w:t>
       </w:r>
     </w:p>
     <w:p>
@@ -3311,7 +4091,7 @@
         <w:t xml:space="preserve">Escudo Fiscal en Ganancias: </w:t>
       </w:r>
       <w:r>
-        <w:t>Calcula el ahorro impositivo resultante de deducir el canon, seguro y mantenimiento de la base imponible del Impuesto a las Ganancias (alícuota del 30% o 35%).</w:t>
+        <w:t>Calcula el crédito fiscal neto generado al computar el gasto de cánones, seguro y mantenimiento como gasto operativo directo en el balance impositivo.</w:t>
       </w:r>
     </w:p>
     <w:p>
@@ -3323,10 +4103,10 @@
           <w:b/>
           <w:color w:val="009FE3"/>
         </w:rPr>
-        <w:t xml:space="preserve">Desglose del Costo Total: </w:t>
+        <w:t xml:space="preserve">Conmutador de Moneda: </w:t>
       </w:r>
       <w:r>
-        <w:t>Tabla de desglose: Pago inicial + Suma de cánones + Seguros + Mantenimientos + Opción de compra final − Ahorro en Ganancias = Costo Neto del Leasing.</w:t>
+        <w:t>Permite evaluar el detalle del leasing en USD (U$D) o en ARS ($) al tipo de cambio proyectado.</w:t>
       </w:r>
     </w:p>
     <w:p>
@@ -3338,10 +4118,10 @@
           <w:b/>
           <w:color w:val="009FE3"/>
         </w:rPr>
-        <w:t xml:space="preserve">Gráfico de Flujo Comparativo: </w:t>
+        <w:t xml:space="preserve">Gráfico Acumulado Contado vs. Leasing: </w:t>
       </w:r>
       <w:r>
-        <w:t>Curva acumulada año por año enfrentando la opción Contado vs. Leasing.</w:t>
+        <w:t>Curva acumulada que muestra el cruce de ambos esquemas y el costo de oportunidad del capital.</w:t>
       </w:r>
     </w:p>
     <w:p>
@@ -3349,19 +4129,118 @@
         <w:pStyle w:val="Heading2"/>
       </w:pPr>
       <w:r>
-        <w:t>3.6. Pestaña 🎯 Análisis de Sensibilidad y Matrices de Riesgo</w:t>
+        <w:t>3.6. Pestaña 🎯 Riesgo: Simulación Monte Carlo, Gráfico de Tornado y Matrices</w:t>
       </w:r>
     </w:p>
     <w:p>
       <w:r>
-        <w:t>Evalúa la robustez del proyecto ante variaciones del entorno macroeconómico y de precios mediante dos matrices cruzadas de mapa de calor:</w:t>
+        <w:t>Evalúa la solidez y volatilidad del proyecto frente al contexto macroeconómico argentino a través de tres herramientas analíticas complementarias:</w:t>
+      </w:r>
+    </w:p>
+    <w:p>
+      <w:pPr>
+        <w:pStyle w:val="Heading3"/>
+      </w:pPr>
+      <w:r>
+        <w:t>A. Simulación Estocástica de Monte Carlo:</w:t>
       </w:r>
     </w:p>
     <w:p>
       <w:r>
-        <w:t>• Matriz 1 (Tarifa vs. CAPEX): Evalúa simultáneamente variaciones de -20% a +20% en el precio de la energía eléctrica y de -15% a +15% en el costo de instalación (U$D/kWp), mostrando el VAN resultante en cada intersección.</w:t>
+        <w:t>A diferencia de los modelos estáticos que muestran un único valor de VAN, la simulación de Monte Carlo ejecuta miles de sorteos probabilísticos modificando simultáneamente seis factores inciertos (irradiación solar ±4%, tarifa eléctrica ±10%, CAPEX ±8%, actualización tarifaria ±5 p.p., devaluación ±5 p.p. y degradación de paneles) mediante distribuciones gaussianas con el método polar de Box-Muller y semilla reproducible.</w:t>
+      </w:r>
+    </w:p>
+    <w:p>
+      <w:pPr>
+        <w:pStyle w:val="ListBullet"/>
+      </w:pPr>
+      <w:r>
+        <w:rPr>
+          <w:b/>
+          <w:color w:val="009FE3"/>
+        </w:rPr>
+        <w:t xml:space="preserve">Selector de Escenarios: </w:t>
+      </w:r>
+      <w:r>
+        <w:t>Permite elegir entre 400 (rápido para tablets), 1.000 (estándar recomendado) y 4.000 escenarios (alta precisión para directorios).</w:t>
+      </w:r>
+    </w:p>
+    <w:p>
+      <w:pPr>
+        <w:pStyle w:val="ListBullet"/>
+      </w:pPr>
+      <w:r>
+        <w:rPr>
+          <w:b/>
+          <w:color w:val="009FE3"/>
+        </w:rPr>
+        <w:t xml:space="preserve">Probabilidad de Éxito P(VAN &gt; 0): </w:t>
+      </w:r>
+      <w:r>
+        <w:t>Porcentaje exacto de escenarios donde el proyecto resulta económicamente rentable. Un valor &gt; 90% indica robustez extrema.</w:t>
+      </w:r>
+    </w:p>
+    <w:p>
+      <w:pPr>
+        <w:pStyle w:val="ListBullet"/>
+      </w:pPr>
+      <w:r>
+        <w:rPr>
+          <w:b/>
+          <w:color w:val="009FE3"/>
+        </w:rPr>
+        <w:t xml:space="preserve">Percentiles P10, P50 y P90: </w:t>
+      </w:r>
+      <w:r>
+        <w:t>P10 representa el escenario pesimista (90% de probabilidad de superarlo), P50 la mediana esperada y P90 el escenario optimista.</w:t>
+      </w:r>
+    </w:p>
+    <w:p>
+      <w:pPr>
+        <w:pStyle w:val="ListBullet"/>
+      </w:pPr>
+      <w:r>
+        <w:rPr>
+          <w:b/>
+          <w:color w:val="009FE3"/>
+        </w:rPr>
+        <w:t xml:space="preserve">Histograma de Frecuencia de VAN: </w:t>
+      </w:r>
+      <w:r>
+        <w:t>Gráfico de barras que representa la distribución del VAN con línea divisoria roja en U$D 0.</w:t>
+      </w:r>
+    </w:p>
+    <w:p>
+      <w:pPr>
+        <w:pStyle w:val="Heading3"/>
+      </w:pPr>
+      <w:r>
+        <w:t>B. Gráfico de Tornado ('Qué variable mueve más el resultado'):</w:t>
+      </w:r>
+    </w:p>
+    <w:p>
+      <w:r>
+        <w:t>Aísla cada variable moviéndola ±1.5 desvíos estándar (±1.5σ) mientras mantiene las demás en su valor base. Ordena las variables de mayor a menor amplitud de VAN, indicando a la dirección qué parámetros deben negociarse prioritariamente (generalmente actualización tarifaria y tipo de cambio en el mercado local).</w:t>
+      </w:r>
+    </w:p>
+    <w:p>
+      <w:pPr>
+        <w:pStyle w:val="Heading3"/>
+      </w:pPr>
+      <w:r>
+        <w:t>C. Matrices de Sensibilidad Cruzada (Mapas de Calor):</w:t>
+      </w:r>
+    </w:p>
+    <w:p>
+      <w:r>
+        <w:t>• Matriz 1 (Tarifa vs. CAPEX): Cruza variaciones de -20% a +20% en la tarifa con variaciones de -15% a +15% en el costo de instalación (U$D/kWp).</w:t>
         <w:br/>
-        <w:t>• Matriz 2 (Inflación Tarifaria vs. Tasa de Descuento): Evalúa el VAN combinando tasas de descuento del 6% al 15% con distintos ritmos de ajuste tarifario anual.</w:t>
+        <w:t>• Matriz 2 (Inflación Tarifaria vs. Tasa de Descuento): Cruza tasas de descuento del 6% al 15% con distintos ritmos de ajuste tarifario anual.</w:t>
+      </w:r>
+    </w:p>
+    <w:p>
+      <w:r>
+        <w:br w:type="page"/>
       </w:r>
     </w:p>
     <w:p>
@@ -3374,7 +4253,7 @@
     </w:p>
     <w:p>
       <w:r>
-        <w:t>Permite seleccionar varios proyectos o variantes de potencia guardadas (ej: 10 kWp vs. 30 kWp vs. 50 kWp) y compararlos en una sola tabla sinóptica evaluando CAPEX, generación anual, cobertura, VAN, TIR, Payback, LCOE y canon de leasing.</w:t>
+        <w:t>Permite seleccionar varios proyectos o variantes de potencia guardadas (ej: 30 kWp sin baterías vs. 30 kWp con BESS vs. 60 kWp para venta a red) y compararlos en una sola tabla sinóptica evaluando CAPEX, generación anual, cobertura de demanda, VAN, TIR, Payback simple y descontado, LCOE y cuota de leasing.</w:t>
       </w:r>
     </w:p>
     <w:p>
@@ -3382,12 +4261,12 @@
         <w:pStyle w:val="Heading2"/>
       </w:pPr>
       <w:r>
-        <w:t>3.8. Pestaña 📄 Propuesta Comercial Ejecutiva (PDF Imprimible)</w:t>
+        <w:t>3.8. Pestaña 📌 Pipeline Comercial, Revisiones Congeladas y Papelera</w:t>
       </w:r>
     </w:p>
     <w:p>
       <w:r>
-        <w:t>Genera una cotización formal ejecutiva lista para entregar al cliente. Incluye:</w:t>
+        <w:t>Proporciona un entorno de gestión comercial especializado para hacer seguimiento de las cotizaciones a lo largo de su ciclo de vida:</w:t>
       </w:r>
     </w:p>
     <w:p>
@@ -3399,10 +4278,10 @@
           <w:b/>
           <w:color w:val="009FE3"/>
         </w:rPr>
-        <w:t xml:space="preserve">Membrete Oficial: </w:t>
+        <w:t xml:space="preserve">Tablero Kanban Interactivo: </w:t>
       </w:r>
       <w:r>
-        <w:t>Logo de ALP GROUP, datos de la empresa, asesor responsable, teléfono, email y plazo de validez de la oferta en días.</w:t>
+        <w:t>Organiza los proyectos en 5 columnas visuales: Borrador (10% de probabilidad), Enviada (30%), En negociación (60%), Ganada (100%) y Perdida (0%).</w:t>
       </w:r>
     </w:p>
     <w:p>
@@ -3414,10 +4293,216 @@
           <w:b/>
           <w:color w:val="009FE3"/>
         </w:rPr>
-        <w:t xml:space="preserve">Ficha Técnica del Cliente &amp; Obra: </w:t>
+        <w:t xml:space="preserve">Ponderación Automática de Cartera: </w:t>
       </w:r>
       <w:r>
-        <w:t>Razón social, CUIT, ubicación, tipo de instalación y especificaciones de paneles, potencia pico y baterías.</w:t>
+        <w:t>Calcula el valor esperado del pipeline multiplicando el CAPEX por la probabilidad asignada a la etapa.</w:t>
+      </w:r>
+    </w:p>
+    <w:p>
+      <w:pPr>
+        <w:pStyle w:val="ListBullet"/>
+      </w:pPr>
+      <w:r>
+        <w:rPr>
+          <w:b/>
+          <w:color w:val="009FE3"/>
+        </w:rPr>
+        <w:t xml:space="preserve">Función '📎 Congelar Revisión': </w:t>
+      </w:r>
+      <w:r>
+        <w:t>Permite generar una copia inmutable del proyecto (Rev. 0, Rev. 1, etc.) en el momento de entregar la cotización al cliente. Si más adelante se modifican parámetros tarifarios o técnicos en el proyecto activo, las revisiones congeladas permanecen intactas para consulta y trazabilidad histórica.</w:t>
+      </w:r>
+    </w:p>
+    <w:p>
+      <w:pPr>
+        <w:pStyle w:val="ListBullet"/>
+      </w:pPr>
+      <w:r>
+        <w:rPr>
+          <w:b/>
+          <w:color w:val="009FE3"/>
+        </w:rPr>
+        <w:t xml:space="preserve">Historial de Revisiones: </w:t>
+      </w:r>
+      <w:r>
+        <w:t>Tabla con fecha, autor, potencia, CAPEX y VAN de cada versión entregada al cliente.</w:t>
+      </w:r>
+    </w:p>
+    <w:p>
+      <w:pPr>
+        <w:pStyle w:val="ListBullet"/>
+      </w:pPr>
+      <w:r>
+        <w:rPr>
+          <w:b/>
+          <w:color w:val="009FE3"/>
+        </w:rPr>
+        <w:t xml:space="preserve">Papelera de Reciclaje ('🗑 Papelera'): </w:t>
+      </w:r>
+      <w:r>
+        <w:t>Resguarda proyectos eliminados accidentalmente, con opción de recuperación inmediata.</w:t>
+      </w:r>
+    </w:p>
+    <w:p>
+      <w:pPr>
+        <w:pStyle w:val="Heading2"/>
+      </w:pPr>
+      <w:r>
+        <w:t>3.9. Pestaña 📊 Tablero Gerencial, Embudo de Ventas y Alertas de Seguimiento</w:t>
+      </w:r>
+    </w:p>
+    <w:p>
+      <w:r>
+        <w:t>Diseñado para gerentes de ventas y directores de proyectos, consolida la información de todos los proyectos activos en un panel de Business Intelligence:</w:t>
+      </w:r>
+    </w:p>
+    <w:p>
+      <w:pPr>
+        <w:pStyle w:val="ListBullet"/>
+      </w:pPr>
+      <w:r>
+        <w:rPr>
+          <w:b/>
+          <w:color w:val="009FE3"/>
+        </w:rPr>
+        <w:t xml:space="preserve">Tarjetas de KPIs Consolidados: </w:t>
+      </w:r>
+      <w:r>
+        <w:t>Potencia total cotizada (MWp), Monto total de cartera en U$D, Pipeline ponderado según probabilidades y Tasa de conversión (Win Rate % de proyectos ganados sobre presentados).</w:t>
+      </w:r>
+    </w:p>
+    <w:p>
+      <w:pPr>
+        <w:pStyle w:val="ListBullet"/>
+      </w:pPr>
+      <w:r>
+        <w:rPr>
+          <w:b/>
+          <w:color w:val="009FE3"/>
+        </w:rPr>
+        <w:t xml:space="preserve">Gráfico de Potencia Cotizada por Mes: </w:t>
+      </w:r>
+      <w:r>
+        <w:t>Histograma temporal que revela el ritmo de generación de presupuestos y la estacionalidad del negocio.</w:t>
+      </w:r>
+    </w:p>
+    <w:p>
+      <w:pPr>
+        <w:pStyle w:val="ListBullet"/>
+      </w:pPr>
+      <w:r>
+        <w:rPr>
+          <w:b/>
+          <w:color w:val="009FE3"/>
+        </w:rPr>
+        <w:t xml:space="preserve">Gráfico de Embudo Comercial (Funnel): </w:t>
+      </w:r>
+      <w:r>
+        <w:t>Visualización de la tasa de retención entre etapas (Borrador → Enviada → Negociación → Cierre).</w:t>
+      </w:r>
+    </w:p>
+    <w:p>
+      <w:pPr>
+        <w:pStyle w:val="ListBullet"/>
+      </w:pPr>
+      <w:r>
+        <w:rPr>
+          <w:b/>
+          <w:color w:val="009FE3"/>
+        </w:rPr>
+        <w:t xml:space="preserve">Desglose Geográfico por Provincia: </w:t>
+      </w:r>
+      <w:r>
+        <w:t>Tabla con la distribución de potencia y clientes en Santa Fe, Buenos Aires, Córdoba, CABA, etc.</w:t>
+      </w:r>
+    </w:p>
+    <w:p>
+      <w:pPr>
+        <w:pStyle w:val="ListBullet"/>
+      </w:pPr>
+      <w:r>
+        <w:rPr>
+          <w:b/>
+          <w:color w:val="009FE3"/>
+        </w:rPr>
+        <w:t xml:space="preserve">Rendimiento por Asesor Comercial: </w:t>
+      </w:r>
+      <w:r>
+        <w:t>Ranking de proyectos y volumen cotizado por cada vendedor del equipo.</w:t>
+      </w:r>
+    </w:p>
+    <w:p>
+      <w:pPr>
+        <w:pStyle w:val="ListBullet"/>
+      </w:pPr>
+      <w:r>
+        <w:rPr>
+          <w:b/>
+          <w:color w:val="009FE3"/>
+        </w:rPr>
+        <w:t xml:space="preserve">Módulo de Alertas ('Necesitan Atención'): </w:t>
+      </w:r>
+      <w:r>
+        <w:t>Algoritmo proactivo que detecta automáticamente propuestas enviadas con más de 15 días sin respuesta o negociaciones estancadas con más de 30 días sin avance, sugiriendo acciones de seguimiento comercial.</w:t>
+      </w:r>
+    </w:p>
+    <w:p>
+      <w:pPr>
+        <w:pStyle w:val="Heading2"/>
+      </w:pPr>
+      <w:r>
+        <w:t>3.10. Pestaña 📄 Propuesta Comercial Ejecutiva (PDF / HTML / WhatsApp / Email)</w:t>
+      </w:r>
+    </w:p>
+    <w:p>
+      <w:r>
+        <w:t>Genera una cotización formal ejecutiva de alto impacto estético, lista para su presentación o envío a clientes corporativos:</w:t>
+      </w:r>
+    </w:p>
+    <w:p>
+      <w:pPr>
+        <w:pStyle w:val="ListBullet"/>
+      </w:pPr>
+      <w:r>
+        <w:rPr>
+          <w:b/>
+          <w:color w:val="009FE3"/>
+        </w:rPr>
+        <w:t xml:space="preserve">Membrete y Branding Oficial: </w:t>
+      </w:r>
+      <w:r>
+        <w:t>Logotipo corporativo de ALP GROUP o de la empresa partner, datos fiscales, asesor responsable y plazo de validez de la oferta en días.</w:t>
+      </w:r>
+    </w:p>
+    <w:p>
+      <w:pPr>
+        <w:pStyle w:val="ListBullet"/>
+      </w:pPr>
+      <w:r>
+        <w:rPr>
+          <w:b/>
+          <w:color w:val="009FE3"/>
+        </w:rPr>
+        <w:t xml:space="preserve">Ficha Técnica del Cliente &amp; Emplazamiento: </w:t>
+      </w:r>
+      <w:r>
+        <w:t>Razón social, CUIT, ciudad, tipo de instalación y especificaciones de módulos, potencia pico y baterías BESS.</w:t>
+      </w:r>
+    </w:p>
+    <w:p>
+      <w:pPr>
+        <w:pStyle w:val="ListBullet"/>
+      </w:pPr>
+      <w:r>
+        <w:rPr>
+          <w:b/>
+          <w:color w:val="009FE3"/>
+        </w:rPr>
+        <w:t xml:space="preserve">Ficha Satelital 3D &amp; Métricas de Cubierta: </w:t>
+      </w:r>
+      <w:r>
+        <w:t>Incorpora la captura fotorrealista del gemelo digital 3D obtenida en la pestaña Techo 3D ('📸 Foto 3D'), superficie útil de techo (m²), azimut, inclinación y factor de ocupación.</w:t>
       </w:r>
     </w:p>
     <w:p>
@@ -3447,7 +4532,7 @@
         <w:t xml:space="preserve">Comparativa Económica de Doble Opción: </w:t>
       </w:r>
       <w:r>
-        <w:t>Resumen lado a lado de Compra Directa (Llave en mano) vs. Financiamiento por Leasing.</w:t>
+        <w:t>Resumen lado a lado de Compra Directa (Llave en mano) vs. Financiamiento por Leasing ALP.</w:t>
       </w:r>
     </w:p>
     <w:p>
@@ -3459,10 +4544,10 @@
           <w:b/>
           <w:color w:val="009FE3"/>
         </w:rPr>
-        <w:t xml:space="preserve">Insignia de Certificación Ambiental: </w:t>
+        <w:t xml:space="preserve">Insignia de Certificación Ambiental ESG: </w:t>
       </w:r>
       <w:r>
-        <w:t>Distintivo ecológico destacando el aporte a la descarbonización y árboles equivalentes.</w:t>
+        <w:t>Distintivo ecológico destacando el aporte a la descarbonización, CO₂ evitado y árboles equivalentes.</w:t>
       </w:r>
     </w:p>
     <w:p>
@@ -3489,10 +4574,10 @@
           <w:b/>
           <w:color w:val="009FE3"/>
         </w:rPr>
-        <w:t xml:space="preserve">Botón 'Imprimir / Guardar en PDF': </w:t>
+        <w:t xml:space="preserve">Exportación Multicanal en 1 Clic: </w:t>
       </w:r>
       <w:r>
-        <w:t>Estilizado con reglas @media print para generar un PDF impecable sin barras ni elementos de interfaz.</w:t>
+        <w:t>Botón '🖨 Imprimir / Guardar en PDF' (formato A4 sin menús), botón '⬇ Descargar HTML' (archivo autónomo portable), botón '💬 WhatsApp' (abre chat con mensaje estructurado y métricas) y botón '✉ Email' (abre correo preformateado).</w:t>
       </w:r>
     </w:p>
     <w:p>
@@ -6252,6 +7337,44 @@
           <w:b/>
           <w:color w:val="009FE3"/>
         </w:rPr>
+        <w:t>❓ ¿Cómo hacer seguimiento comercial y congelar una versión entregada?</w:t>
+        <w:br/>
+      </w:r>
+      <w:r>
+        <w:rPr>
+          <w:color w:val="334155"/>
+        </w:rPr>
+        <w:t>💡 En la pestaña '📌 Pipeline', podés mover la oportunidad entre las etapas del embudo comercial (Borrador, Enviada, Negociación, Ganada). Al enviar una cotización formal al cliente, presioná '📎 Congelar revisión'. El sistema creará una copia histórica inmutable (Rev. 0, Rev. 1, etc.) preservando intactos los valores cotizados para auditoría o comparaciones futuras.</w:t>
+      </w:r>
+    </w:p>
+    <w:p>
+      <w:pPr>
+        <w:spacing w:after="160"/>
+      </w:pPr>
+      <w:r>
+        <w:rPr>
+          <w:b/>
+          <w:color w:val="009FE3"/>
+        </w:rPr>
+        <w:t>❓ ¿Cómo interpretar la simulación de Monte Carlo y el gráfico de Tornado?</w:t>
+        <w:br/>
+      </w:r>
+      <w:r>
+        <w:rPr>
+          <w:color w:val="334155"/>
+        </w:rPr>
+        <w:t>💡 En la pestaña '🎯 Riesgo', presioná '▶ Correr simulación'. El indicador P(VAN &gt; 0) te indica la probabilidad matemática de rentabilidad sorteando miles de escenarios combinados. En el Gráfico de Tornado, las barras más anchas señalan los factores macroeconómicos o de ingeniería que más mueven el VAN, marcando prioridades para la negociación comercial.</w:t>
+      </w:r>
+    </w:p>
+    <w:p>
+      <w:pPr>
+        <w:spacing w:after="160"/>
+      </w:pPr>
+      <w:r>
+        <w:rPr>
+          <w:b/>
+          <w:color w:val="009FE3"/>
+        </w:rPr>
         <w:t>❓ ¿Qué hacer si un cliente tiene consumos estacionales variables?</w:t>
         <w:br/>
       </w:r>
@@ -6297,7 +7420,7 @@
         <w:rPr>
           <w:color w:val="334155"/>
         </w:rPr>
-        <w:t>💡 Ingresá a la pestaña '📄 Propuesta Comercial' y hacé clic en '🖨 Imprimir / Guardar en PDF'. Seleccioná la impresora 'Guardar como PDF' en tu navegador para generar un documento ejecutivo listo para enviar por email o WhatsApp.</w:t>
+        <w:t>💡 Ingresá a la pestaña '📄 Propuesta' y elegí entre '🖨 Imprimir / Guardar en PDF' (formato limpio A4), '⬇ Descargar HTML' (archivo interactivo sin conexión), '💬 WhatsApp' (mensaje estructurado con métricas de ahorro) o '✉ Email'.</w:t>
       </w:r>
     </w:p>
     <w:p>

</xml_diff>